<commit_message>
added traefik and rabbitmq
</commit_message>
<xml_diff>
--- a/Documentatie.docx
+++ b/Documentatie.docx
@@ -458,7 +458,7 @@
                 <w:noProof/>
                 <w:webHidden/>
               </w:rPr>
-              <w:t>3</w:t>
+              <w:t>4</w:t>
             </w:r>
           </w:hyperlink>
         </w:p>
@@ -518,7 +518,7 @@
                 <w:noProof/>
                 <w:webHidden/>
               </w:rPr>
-              <w:t>4</w:t>
+              <w:t>6</w:t>
             </w:r>
           </w:hyperlink>
         </w:p>
@@ -577,7 +577,7 @@
                 <w:noProof/>
                 <w:webHidden/>
               </w:rPr>
-              <w:t>6</w:t>
+              <w:t>7</w:t>
             </w:r>
           </w:hyperlink>
         </w:p>
@@ -633,7 +633,7 @@
                 <w:noProof/>
                 <w:webHidden/>
               </w:rPr>
-              <w:t>6</w:t>
+              <w:t>8</w:t>
             </w:r>
           </w:hyperlink>
         </w:p>
@@ -692,46 +692,7 @@
                 <w:noProof/>
                 <w:webHidden/>
               </w:rPr>
-              <w:fldChar w:fldCharType="begin"/>
-            </w:r>
-            <w:r>
-              <w:rPr>
-                <w:rStyle w:val="Hyperlink"/>
-                <w:noProof/>
-                <w:webHidden/>
-              </w:rPr>
-              <w:instrText xml:space="preserve"> PAGEREF _Toc156191306 \h </w:instrText>
-            </w:r>
-            <w:r>
-              <w:rPr>
-                <w:rStyle w:val="Hyperlink"/>
-                <w:noProof/>
-                <w:webHidden/>
-              </w:rPr>
-            </w:r>
-            <w:r>
-              <w:rPr>
-                <w:rStyle w:val="Hyperlink"/>
-                <w:noProof/>
-                <w:webHidden/>
-              </w:rPr>
-              <w:fldChar w:fldCharType="separate"/>
-            </w:r>
-            <w:r>
-              <w:rPr>
-                <w:rStyle w:val="Hyperlink"/>
-                <w:noProof/>
-                <w:webHidden/>
-              </w:rPr>
-              <w:t>7</w:t>
-            </w:r>
-            <w:r>
-              <w:rPr>
-                <w:rStyle w:val="Hyperlink"/>
-                <w:noProof/>
-                <w:webHidden/>
-              </w:rPr>
-              <w:fldChar w:fldCharType="end"/>
+              <w:t>9</w:t>
             </w:r>
           </w:hyperlink>
         </w:p>
@@ -787,7 +748,7 @@
                 <w:noProof/>
                 <w:webHidden/>
               </w:rPr>
-              <w:t>8</w:t>
+              <w:t>10</w:t>
             </w:r>
           </w:hyperlink>
         </w:p>
@@ -829,14 +790,7 @@
                 <w:rStyle w:val="Hyperlink"/>
                 <w:noProof/>
               </w:rPr>
-              <w:t>User</w:t>
-            </w:r>
-            <w:r>
-              <w:rPr>
-                <w:rStyle w:val="Hyperlink"/>
-                <w:noProof/>
-              </w:rPr>
-              <w:t xml:space="preserve"> Backend UML diagram</w:t>
+              <w:t>User Backend UML diagram</w:t>
             </w:r>
             <w:r>
               <w:rPr>
@@ -850,7 +804,7 @@
                 <w:noProof/>
                 <w:webHidden/>
               </w:rPr>
-              <w:t>9</w:t>
+              <w:t>11</w:t>
             </w:r>
           </w:hyperlink>
         </w:p>
@@ -906,7 +860,7 @@
                 <w:noProof/>
                 <w:webHidden/>
               </w:rPr>
-              <w:t>10</w:t>
+              <w:t>12</w:t>
             </w:r>
           </w:hyperlink>
         </w:p>
@@ -948,6 +902,195 @@
                 <w:rStyle w:val="Hyperlink"/>
                 <w:noProof/>
               </w:rPr>
+              <w:t>Configuration of RabbitMQ</w:t>
+            </w:r>
+            <w:r>
+              <w:rPr>
+                <w:noProof/>
+                <w:webHidden/>
+              </w:rPr>
+              <w:tab/>
+            </w:r>
+            <w:r>
+              <w:rPr>
+                <w:noProof/>
+                <w:webHidden/>
+              </w:rPr>
+              <w:t>15</w:t>
+            </w:r>
+          </w:hyperlink>
+        </w:p>
+        <w:p>
+          <w:pPr>
+            <w:pStyle w:val="TOC1"/>
+            <w:tabs>
+              <w:tab w:val="left" w:pos="440"/>
+              <w:tab w:val="right" w:leader="dot" w:pos="9350"/>
+            </w:tabs>
+            <w:rPr>
+              <w:noProof/>
+            </w:rPr>
+          </w:pPr>
+          <w:hyperlink w:anchor="_Toc156191306" w:history="1">
+            <w:r>
+              <w:rPr>
+                <w:rStyle w:val="Hyperlink"/>
+                <w:noProof/>
+              </w:rPr>
+              <w:t>11</w:t>
+            </w:r>
+            <w:r>
+              <w:rPr>
+                <w:rStyle w:val="Hyperlink"/>
+                <w:noProof/>
+              </w:rPr>
+              <w:t>.</w:t>
+            </w:r>
+            <w:r>
+              <w:rPr>
+                <w:noProof/>
+                <w:sz w:val="22"/>
+              </w:rPr>
+              <w:tab/>
+            </w:r>
+            <w:r>
+              <w:rPr>
+                <w:rStyle w:val="Hyperlink"/>
+                <w:noProof/>
+              </w:rPr>
+              <w:t>Traefik</w:t>
+            </w:r>
+            <w:r>
+              <w:rPr>
+                <w:rStyle w:val="Hyperlink"/>
+                <w:noProof/>
+              </w:rPr>
+              <w:t xml:space="preserve"> </w:t>
+            </w:r>
+            <w:r>
+              <w:rPr>
+                <w:rStyle w:val="Hyperlink"/>
+                <w:noProof/>
+              </w:rPr>
+              <w:t>configuration</w:t>
+            </w:r>
+            <w:r>
+              <w:rPr>
+                <w:noProof/>
+                <w:webHidden/>
+              </w:rPr>
+              <w:tab/>
+            </w:r>
+            <w:r>
+              <w:rPr>
+                <w:noProof/>
+                <w:webHidden/>
+              </w:rPr>
+              <w:t>15</w:t>
+            </w:r>
+          </w:hyperlink>
+        </w:p>
+        <w:p>
+          <w:pPr>
+            <w:pStyle w:val="TOC1"/>
+            <w:tabs>
+              <w:tab w:val="left" w:pos="440"/>
+              <w:tab w:val="right" w:leader="dot" w:pos="9350"/>
+            </w:tabs>
+            <w:rPr>
+              <w:noProof/>
+            </w:rPr>
+          </w:pPr>
+          <w:hyperlink w:anchor="_Toc156191306" w:history="1">
+            <w:r>
+              <w:rPr>
+                <w:rStyle w:val="Hyperlink"/>
+                <w:noProof/>
+              </w:rPr>
+              <w:t>12</w:t>
+            </w:r>
+            <w:r>
+              <w:rPr>
+                <w:rStyle w:val="Hyperlink"/>
+                <w:noProof/>
+              </w:rPr>
+              <w:t>.</w:t>
+            </w:r>
+            <w:r>
+              <w:rPr>
+                <w:noProof/>
+                <w:sz w:val="22"/>
+              </w:rPr>
+              <w:tab/>
+            </w:r>
+            <w:r>
+              <w:rPr>
+                <w:rStyle w:val="Hyperlink"/>
+                <w:noProof/>
+              </w:rPr>
+              <w:t>Project Overview</w:t>
+            </w:r>
+            <w:r>
+              <w:rPr>
+                <w:noProof/>
+                <w:webHidden/>
+              </w:rPr>
+              <w:tab/>
+            </w:r>
+            <w:r>
+              <w:rPr>
+                <w:noProof/>
+                <w:webHidden/>
+              </w:rPr>
+              <w:t>16</w:t>
+            </w:r>
+          </w:hyperlink>
+        </w:p>
+        <w:p>
+          <w:pPr>
+            <w:pStyle w:val="TOC1"/>
+            <w:tabs>
+              <w:tab w:val="left" w:pos="440"/>
+              <w:tab w:val="right" w:leader="dot" w:pos="9350"/>
+            </w:tabs>
+            <w:rPr>
+              <w:noProof/>
+            </w:rPr>
+          </w:pPr>
+          <w:hyperlink w:anchor="_Toc156191306" w:history="1">
+            <w:r>
+              <w:rPr>
+                <w:rStyle w:val="Hyperlink"/>
+                <w:noProof/>
+              </w:rPr>
+              <w:t>1</w:t>
+            </w:r>
+            <w:r>
+              <w:rPr>
+                <w:rStyle w:val="Hyperlink"/>
+                <w:noProof/>
+              </w:rPr>
+              <w:t>3</w:t>
+            </w:r>
+            <w:r>
+              <w:rPr>
+                <w:rStyle w:val="Hyperlink"/>
+                <w:noProof/>
+              </w:rPr>
+              <w:t>.</w:t>
+            </w:r>
+            <w:r>
+              <w:rPr>
+                <w:noProof/>
+                <w:sz w:val="22"/>
+              </w:rPr>
+              <w:tab/>
+            </w:r>
+            <w:r>
+              <w:rPr>
+                <w:rStyle w:val="Hyperlink"/>
+                <w:noProof/>
+              </w:rPr>
               <w:t>References</w:t>
             </w:r>
             <w:r>
@@ -962,7 +1105,7 @@
                 <w:noProof/>
                 <w:webHidden/>
               </w:rPr>
-              <w:t>13</w:t>
+              <w:t>17</w:t>
             </w:r>
           </w:hyperlink>
         </w:p>
@@ -989,11 +1132,6 @@
     <w:p/>
     <w:p/>
     <w:p/>
-    <w:p/>
-    <w:p/>
-    <w:p/>
-    <w:p/>
-    <w:p/>
     <w:p>
       <w:pPr>
         <w:pStyle w:val="Title"/>
@@ -1258,6 +1396,458 @@
     </w:p>
     <w:p>
       <w:pPr>
+        <w:ind w:left="720"/>
+        <w:jc w:val="both"/>
+        <w:rPr>
+          <w:sz w:val="24"/>
+          <w:szCs w:val="24"/>
+        </w:rPr>
+      </w:pPr>
+    </w:p>
+    <w:p>
+      <w:pPr>
+        <w:ind w:left="360" w:firstLine="360"/>
+        <w:jc w:val="both"/>
+        <w:rPr>
+          <w:sz w:val="24"/>
+          <w:szCs w:val="24"/>
+        </w:rPr>
+      </w:pPr>
+      <w:r>
+        <w:rPr>
+          <w:sz w:val="24"/>
+          <w:szCs w:val="24"/>
+        </w:rPr>
+        <w:t xml:space="preserve">The </w:t>
+      </w:r>
+      <w:r>
+        <w:rPr>
+          <w:b/>
+          <w:bCs/>
+          <w:sz w:val="24"/>
+          <w:szCs w:val="24"/>
+        </w:rPr>
+        <w:t>Monitoring and Communication Microservice</w:t>
+      </w:r>
+      <w:r>
+        <w:rPr>
+          <w:sz w:val="24"/>
+          <w:szCs w:val="24"/>
+        </w:rPr>
+        <w:t xml:space="preserve"> is a critical component of the energy management system. It is responsible for managing and analyzing the energy consumption of connected smart devices and notifying users when predefined thresholds are exceeded.</w:t>
+      </w:r>
+      <w:r>
+        <w:rPr>
+          <w:sz w:val="24"/>
+          <w:szCs w:val="24"/>
+        </w:rPr>
+        <w:t xml:space="preserve"> </w:t>
+      </w:r>
+    </w:p>
+    <w:p>
+      <w:pPr>
+        <w:ind w:left="360"/>
+        <w:jc w:val="both"/>
+        <w:rPr>
+          <w:sz w:val="24"/>
+          <w:szCs w:val="24"/>
+        </w:rPr>
+      </w:pPr>
+      <w:r>
+        <w:rPr>
+          <w:sz w:val="24"/>
+          <w:szCs w:val="24"/>
+        </w:rPr>
+        <w:t xml:space="preserve">The core functionality involves consuming data transmitted by smart device simulators via RabbitMQ, utilizing the </w:t>
+      </w:r>
+      <w:r>
+        <w:rPr>
+          <w:b/>
+          <w:bCs/>
+          <w:sz w:val="24"/>
+          <w:szCs w:val="24"/>
+        </w:rPr>
+        <w:t>Message Consumer</w:t>
+      </w:r>
+      <w:r>
+        <w:rPr>
+          <w:sz w:val="24"/>
+          <w:szCs w:val="24"/>
+        </w:rPr>
+        <w:t xml:space="preserve"> component. This component processes the messages, calculates the total hourly energy consumption for each device, and stores the results in a dedicated database called the </w:t>
+      </w:r>
+      <w:r>
+        <w:rPr>
+          <w:b/>
+          <w:bCs/>
+          <w:sz w:val="24"/>
+          <w:szCs w:val="24"/>
+        </w:rPr>
+        <w:t>Monitoring Database</w:t>
+      </w:r>
+      <w:r>
+        <w:rPr>
+          <w:sz w:val="24"/>
+          <w:szCs w:val="24"/>
+        </w:rPr>
+        <w:t>.</w:t>
+      </w:r>
+    </w:p>
+    <w:p>
+      <w:pPr>
+        <w:ind w:left="360"/>
+        <w:jc w:val="both"/>
+        <w:rPr>
+          <w:sz w:val="24"/>
+          <w:szCs w:val="24"/>
+        </w:rPr>
+      </w:pPr>
+    </w:p>
+    <w:p>
+      <w:pPr>
+        <w:ind w:left="360"/>
+        <w:jc w:val="both"/>
+        <w:rPr>
+          <w:sz w:val="24"/>
+          <w:szCs w:val="24"/>
+        </w:rPr>
+      </w:pPr>
+    </w:p>
+    <w:p>
+      <w:pPr>
+        <w:ind w:left="360"/>
+        <w:jc w:val="both"/>
+        <w:rPr>
+          <w:sz w:val="24"/>
+          <w:szCs w:val="24"/>
+        </w:rPr>
+      </w:pPr>
+      <w:r>
+        <w:rPr>
+          <w:sz w:val="24"/>
+          <w:szCs w:val="24"/>
+        </w:rPr>
+        <w:t xml:space="preserve">In cases where the hourly consumption exceeds the maximum configured threshold for a device, the microservice sends real-time notifications to users via </w:t>
+      </w:r>
+      <w:r>
+        <w:rPr>
+          <w:b/>
+          <w:bCs/>
+          <w:sz w:val="24"/>
+          <w:szCs w:val="24"/>
+        </w:rPr>
+        <w:t>WebSocket</w:t>
+      </w:r>
+      <w:r>
+        <w:rPr>
+          <w:sz w:val="24"/>
+          <w:szCs w:val="24"/>
+        </w:rPr>
+        <w:t>. This ensures fast and efficient interaction with the client application, allowing users to receive instant updates.</w:t>
+      </w:r>
+    </w:p>
+    <w:p>
+      <w:pPr>
+        <w:ind w:left="360" w:firstLine="360"/>
+        <w:jc w:val="both"/>
+        <w:rPr>
+          <w:sz w:val="24"/>
+          <w:szCs w:val="24"/>
+        </w:rPr>
+      </w:pPr>
+      <w:r>
+        <w:rPr>
+          <w:sz w:val="24"/>
+          <w:szCs w:val="24"/>
+        </w:rPr>
+        <w:lastRenderedPageBreak/>
+        <w:t xml:space="preserve">The </w:t>
+      </w:r>
+      <w:r>
+        <w:rPr>
+          <w:b/>
+          <w:bCs/>
+          <w:sz w:val="24"/>
+          <w:szCs w:val="24"/>
+        </w:rPr>
+        <w:t>Smart Metering Device Simulator</w:t>
+      </w:r>
+      <w:r>
+        <w:rPr>
+          <w:sz w:val="24"/>
+          <w:szCs w:val="24"/>
+        </w:rPr>
+        <w:t xml:space="preserve"> is a crucial component for testing and validating the system's functionalities. It emulates the behavior of real devices by generating and sending simulated data to RabbitMQ.</w:t>
+      </w:r>
+    </w:p>
+    <w:p>
+      <w:pPr>
+        <w:ind w:left="360"/>
+        <w:jc w:val="both"/>
+        <w:rPr>
+          <w:sz w:val="24"/>
+          <w:szCs w:val="24"/>
+        </w:rPr>
+      </w:pPr>
+      <w:r>
+        <w:rPr>
+          <w:sz w:val="24"/>
+          <w:szCs w:val="24"/>
+        </w:rPr>
+        <w:t>The transmitted data is extracted from a predefined CSV file (e.g., sensor.csv) and organized into JSON messages, which include:</w:t>
+      </w:r>
+    </w:p>
+    <w:p>
+      <w:pPr>
+        <w:numPr>
+          <w:ilvl w:val="0"/>
+          <w:numId w:val="39"/>
+        </w:numPr>
+        <w:jc w:val="both"/>
+        <w:rPr>
+          <w:sz w:val="24"/>
+          <w:szCs w:val="24"/>
+        </w:rPr>
+      </w:pPr>
+      <w:r>
+        <w:rPr>
+          <w:b/>
+          <w:bCs/>
+          <w:sz w:val="24"/>
+          <w:szCs w:val="24"/>
+        </w:rPr>
+        <w:t>Timestamp</w:t>
+      </w:r>
+      <w:r>
+        <w:rPr>
+          <w:sz w:val="24"/>
+          <w:szCs w:val="24"/>
+        </w:rPr>
+        <w:t>: A time marker generated based on the system clock.</w:t>
+      </w:r>
+    </w:p>
+    <w:p>
+      <w:pPr>
+        <w:numPr>
+          <w:ilvl w:val="0"/>
+          <w:numId w:val="39"/>
+        </w:numPr>
+        <w:jc w:val="both"/>
+        <w:rPr>
+          <w:sz w:val="24"/>
+          <w:szCs w:val="24"/>
+        </w:rPr>
+      </w:pPr>
+      <w:r>
+        <w:rPr>
+          <w:b/>
+          <w:bCs/>
+          <w:sz w:val="24"/>
+          <w:szCs w:val="24"/>
+        </w:rPr>
+        <w:t>Device ID</w:t>
+      </w:r>
+      <w:r>
+        <w:rPr>
+          <w:sz w:val="24"/>
+          <w:szCs w:val="24"/>
+        </w:rPr>
+        <w:t>: A unique identifier for the device associated with a user.</w:t>
+      </w:r>
+    </w:p>
+    <w:p>
+      <w:pPr>
+        <w:numPr>
+          <w:ilvl w:val="0"/>
+          <w:numId w:val="39"/>
+        </w:numPr>
+        <w:jc w:val="both"/>
+        <w:rPr>
+          <w:sz w:val="24"/>
+          <w:szCs w:val="24"/>
+        </w:rPr>
+      </w:pPr>
+      <w:r>
+        <w:rPr>
+          <w:b/>
+          <w:bCs/>
+          <w:sz w:val="24"/>
+          <w:szCs w:val="24"/>
+        </w:rPr>
+        <w:t>Measurement Value</w:t>
+      </w:r>
+      <w:r>
+        <w:rPr>
+          <w:sz w:val="24"/>
+          <w:szCs w:val="24"/>
+        </w:rPr>
+        <w:t>: A numeric value representing energy consumption.</w:t>
+      </w:r>
+    </w:p>
+    <w:p>
+      <w:pPr>
+        <w:ind w:left="360"/>
+        <w:jc w:val="both"/>
+        <w:rPr>
+          <w:sz w:val="24"/>
+          <w:szCs w:val="24"/>
+        </w:rPr>
+      </w:pPr>
+      <w:r>
+        <w:rPr>
+          <w:sz w:val="24"/>
+          <w:szCs w:val="24"/>
+        </w:rPr>
+        <w:t>The simulator sends messages at regular intervals of 10 minutes, ensuring a constant data flow for the monitoring microservice. Example of a JSON message format:</w:t>
+      </w:r>
+    </w:p>
+    <w:p>
+      <w:pPr>
+        <w:ind w:left="2160"/>
+        <w:jc w:val="both"/>
+        <w:rPr>
+          <w:sz w:val="24"/>
+          <w:szCs w:val="24"/>
+        </w:rPr>
+      </w:pPr>
+      <w:r>
+        <w:rPr>
+          <w:sz w:val="24"/>
+          <w:szCs w:val="24"/>
+        </w:rPr>
+        <w:t>{</w:t>
+      </w:r>
+    </w:p>
+    <w:p>
+      <w:pPr>
+        <w:ind w:left="2160"/>
+        <w:jc w:val="both"/>
+        <w:rPr>
+          <w:sz w:val="24"/>
+          <w:szCs w:val="24"/>
+        </w:rPr>
+      </w:pPr>
+      <w:r>
+        <w:rPr>
+          <w:sz w:val="24"/>
+          <w:szCs w:val="24"/>
+        </w:rPr>
+        <w:t xml:space="preserve">  "timestamp": 1570654800000,</w:t>
+      </w:r>
+    </w:p>
+    <w:p>
+      <w:pPr>
+        <w:ind w:left="2160"/>
+        <w:jc w:val="both"/>
+        <w:rPr>
+          <w:sz w:val="24"/>
+          <w:szCs w:val="24"/>
+        </w:rPr>
+      </w:pPr>
+      <w:r>
+        <w:rPr>
+          <w:sz w:val="24"/>
+          <w:szCs w:val="24"/>
+        </w:rPr>
+        <w:t xml:space="preserve">  "</w:t>
+      </w:r>
+      <w:proofErr w:type="spellStart"/>
+      <w:proofErr w:type="gramStart"/>
+      <w:r>
+        <w:rPr>
+          <w:sz w:val="24"/>
+          <w:szCs w:val="24"/>
+        </w:rPr>
+        <w:t>device</w:t>
+      </w:r>
+      <w:proofErr w:type="gramEnd"/>
+      <w:r>
+        <w:rPr>
+          <w:sz w:val="24"/>
+          <w:szCs w:val="24"/>
+        </w:rPr>
+        <w:t>_id</w:t>
+      </w:r>
+      <w:proofErr w:type="spellEnd"/>
+      <w:r>
+        <w:rPr>
+          <w:sz w:val="24"/>
+          <w:szCs w:val="24"/>
+        </w:rPr>
+        <w:t>": "5c2494a3-1140-4c7a-991a-a1a2561c6bc2",</w:t>
+      </w:r>
+    </w:p>
+    <w:p>
+      <w:pPr>
+        <w:ind w:left="2160"/>
+        <w:jc w:val="both"/>
+        <w:rPr>
+          <w:sz w:val="24"/>
+          <w:szCs w:val="24"/>
+        </w:rPr>
+      </w:pPr>
+      <w:r>
+        <w:rPr>
+          <w:sz w:val="24"/>
+          <w:szCs w:val="24"/>
+        </w:rPr>
+        <w:t xml:space="preserve">  "</w:t>
+      </w:r>
+      <w:proofErr w:type="spellStart"/>
+      <w:proofErr w:type="gramStart"/>
+      <w:r>
+        <w:rPr>
+          <w:sz w:val="24"/>
+          <w:szCs w:val="24"/>
+        </w:rPr>
+        <w:t>measurement</w:t>
+      </w:r>
+      <w:proofErr w:type="gramEnd"/>
+      <w:r>
+        <w:rPr>
+          <w:sz w:val="24"/>
+          <w:szCs w:val="24"/>
+        </w:rPr>
+        <w:t>_value</w:t>
+      </w:r>
+      <w:proofErr w:type="spellEnd"/>
+      <w:r>
+        <w:rPr>
+          <w:sz w:val="24"/>
+          <w:szCs w:val="24"/>
+        </w:rPr>
+        <w:t>": 0.1</w:t>
+      </w:r>
+    </w:p>
+    <w:p>
+      <w:pPr>
+        <w:ind w:left="2160"/>
+        <w:jc w:val="both"/>
+        <w:rPr>
+          <w:sz w:val="24"/>
+          <w:szCs w:val="24"/>
+        </w:rPr>
+      </w:pPr>
+      <w:r>
+        <w:rPr>
+          <w:sz w:val="24"/>
+          <w:szCs w:val="24"/>
+        </w:rPr>
+        <w:t>}</w:t>
+      </w:r>
+    </w:p>
+    <w:p>
+      <w:pPr>
+        <w:ind w:left="360"/>
+        <w:jc w:val="both"/>
+        <w:rPr>
+          <w:sz w:val="24"/>
+          <w:szCs w:val="24"/>
+        </w:rPr>
+      </w:pPr>
+    </w:p>
+    <w:p>
+      <w:pPr>
         <w:ind w:firstLine="360"/>
         <w:jc w:val="both"/>
         <w:rPr>
@@ -1362,28 +1952,7 @@
           <w:sz w:val="24"/>
           <w:szCs w:val="24"/>
         </w:rPr>
-        <w:t>: Manages user data, such as name</w:t>
-      </w:r>
-      <w:r>
-        <w:rPr>
-          <w:sz w:val="24"/>
-          <w:szCs w:val="24"/>
-        </w:rPr>
-        <w:t xml:space="preserve"> and</w:t>
-      </w:r>
-      <w:r>
-        <w:rPr>
-          <w:sz w:val="24"/>
-          <w:szCs w:val="24"/>
-        </w:rPr>
-        <w:t xml:space="preserve"> contact details</w:t>
-      </w:r>
-      <w:r>
-        <w:rPr>
-          <w:sz w:val="24"/>
-          <w:szCs w:val="24"/>
-        </w:rPr>
-        <w:t>.</w:t>
+        <w:t>: Manages user data, such as name and contact details.</w:t>
       </w:r>
     </w:p>
     <w:p>
@@ -1420,17 +1989,166 @@
     </w:p>
     <w:p>
       <w:pPr>
-        <w:rPr>
-          <w:sz w:val="24"/>
-          <w:szCs w:val="24"/>
-        </w:rPr>
-      </w:pPr>
-      <w:r>
-        <w:rPr>
-          <w:sz w:val="24"/>
-          <w:szCs w:val="24"/>
-        </w:rPr>
-        <w:lastRenderedPageBreak/>
+        <w:pStyle w:val="ListParagraph"/>
+        <w:numPr>
+          <w:ilvl w:val="1"/>
+          <w:numId w:val="13"/>
+        </w:numPr>
+        <w:rPr>
+          <w:sz w:val="24"/>
+          <w:szCs w:val="24"/>
+        </w:rPr>
+      </w:pPr>
+      <w:r>
+        <w:rPr>
+          <w:b/>
+          <w:bCs/>
+          <w:sz w:val="24"/>
+          <w:szCs w:val="24"/>
+        </w:rPr>
+        <w:t>Monitoring and Communication Backend</w:t>
+      </w:r>
+      <w:r>
+        <w:rPr>
+          <w:sz w:val="24"/>
+          <w:szCs w:val="24"/>
+        </w:rPr>
+        <w:t>: Processes real-time energy consumption data from devices, stores it in the monitoring database, and sends alerts to users if thresholds are exceeded. This service integrates with RabbitMQ for message queuing and WebSocket for real-time communication.</w:t>
+      </w:r>
+    </w:p>
+    <w:p>
+      <w:pPr>
+        <w:pStyle w:val="ListParagraph"/>
+        <w:numPr>
+          <w:ilvl w:val="1"/>
+          <w:numId w:val="13"/>
+        </w:numPr>
+        <w:rPr>
+          <w:sz w:val="24"/>
+          <w:szCs w:val="24"/>
+        </w:rPr>
+      </w:pPr>
+      <w:r>
+        <w:rPr>
+          <w:b/>
+          <w:bCs/>
+          <w:sz w:val="24"/>
+          <w:szCs w:val="24"/>
+        </w:rPr>
+        <w:t>Standalone Smart Meter Simulator</w:t>
+      </w:r>
+      <w:r>
+        <w:rPr>
+          <w:sz w:val="24"/>
+          <w:szCs w:val="24"/>
+        </w:rPr>
+        <w:t>: A separate application that emulates device behavior by sending simulated energy consumption data to RabbitMQ at regular intervals.</w:t>
+      </w:r>
+    </w:p>
+    <w:p>
+      <w:pPr>
+        <w:pStyle w:val="ListParagraph"/>
+        <w:ind w:left="1440"/>
+        <w:rPr>
+          <w:b/>
+          <w:bCs/>
+          <w:sz w:val="24"/>
+          <w:szCs w:val="24"/>
+        </w:rPr>
+      </w:pPr>
+    </w:p>
+    <w:p>
+      <w:pPr>
+        <w:pStyle w:val="ListParagraph"/>
+        <w:ind w:left="1440"/>
+        <w:rPr>
+          <w:b/>
+          <w:bCs/>
+          <w:sz w:val="24"/>
+          <w:szCs w:val="24"/>
+        </w:rPr>
+      </w:pPr>
+    </w:p>
+    <w:p>
+      <w:pPr>
+        <w:pStyle w:val="ListParagraph"/>
+        <w:ind w:left="1440"/>
+        <w:rPr>
+          <w:b/>
+          <w:bCs/>
+          <w:sz w:val="24"/>
+          <w:szCs w:val="24"/>
+        </w:rPr>
+      </w:pPr>
+    </w:p>
+    <w:p>
+      <w:pPr>
+        <w:pStyle w:val="ListParagraph"/>
+        <w:ind w:left="1440"/>
+        <w:rPr>
+          <w:b/>
+          <w:bCs/>
+          <w:sz w:val="24"/>
+          <w:szCs w:val="24"/>
+        </w:rPr>
+      </w:pPr>
+    </w:p>
+    <w:p>
+      <w:pPr>
+        <w:pStyle w:val="ListParagraph"/>
+        <w:ind w:left="1440"/>
+        <w:rPr>
+          <w:b/>
+          <w:bCs/>
+          <w:sz w:val="24"/>
+          <w:szCs w:val="24"/>
+        </w:rPr>
+      </w:pPr>
+    </w:p>
+    <w:p>
+      <w:pPr>
+        <w:pStyle w:val="ListParagraph"/>
+        <w:ind w:left="1440"/>
+        <w:rPr>
+          <w:b/>
+          <w:bCs/>
+          <w:sz w:val="24"/>
+          <w:szCs w:val="24"/>
+        </w:rPr>
+      </w:pPr>
+    </w:p>
+    <w:p>
+      <w:pPr>
+        <w:pStyle w:val="ListParagraph"/>
+        <w:ind w:left="1440"/>
+        <w:rPr>
+          <w:sz w:val="24"/>
+          <w:szCs w:val="24"/>
+        </w:rPr>
+      </w:pPr>
+    </w:p>
+    <w:p>
+      <w:pPr>
+        <w:pStyle w:val="ListParagraph"/>
+        <w:ind w:left="1440"/>
+        <w:rPr>
+          <w:sz w:val="24"/>
+          <w:szCs w:val="24"/>
+        </w:rPr>
+      </w:pPr>
+    </w:p>
+    <w:p>
+      <w:pPr>
+        <w:rPr>
+          <w:sz w:val="24"/>
+          <w:szCs w:val="24"/>
+        </w:rPr>
+      </w:pPr>
+      <w:r>
+        <w:rPr>
+          <w:sz w:val="24"/>
+          <w:szCs w:val="24"/>
+        </w:rPr>
         <w:t xml:space="preserve">    </w:t>
       </w:r>
       <w:r>
@@ -1448,6 +2166,9 @@
         <w:t xml:space="preserve">    </w:t>
       </w:r>
       <w:r>
+        <w:rPr>
+          <w:noProof/>
+        </w:rPr>
         <w:drawing>
           <wp:inline distT="0" distB="0" distL="0" distR="0" wp14:anchorId="46CE113B" wp14:editId="76731720">
             <wp:extent cx="2103120" cy="1264523"/>
@@ -1494,6 +2215,14 @@
     </w:p>
     <w:p>
       <w:pPr>
+        <w:rPr>
+          <w:sz w:val="24"/>
+          <w:szCs w:val="24"/>
+        </w:rPr>
+      </w:pPr>
+    </w:p>
+    <w:p>
+      <w:pPr>
         <w:pStyle w:val="ListParagraph"/>
         <w:numPr>
           <w:ilvl w:val="0"/>
@@ -1518,7 +2247,23 @@
           <w:sz w:val="24"/>
           <w:szCs w:val="24"/>
         </w:rPr>
-        <w:t>: Each backend connects to its own MySQL database instance, where:</w:t>
+        <w:t xml:space="preserve">: Each backend </w:t>
+      </w:r>
+      <w:proofErr w:type="gramStart"/>
+      <w:r>
+        <w:rPr>
+          <w:sz w:val="24"/>
+          <w:szCs w:val="24"/>
+        </w:rPr>
+        <w:t>connects</w:t>
+      </w:r>
+      <w:proofErr w:type="gramEnd"/>
+      <w:r>
+        <w:rPr>
+          <w:sz w:val="24"/>
+          <w:szCs w:val="24"/>
+        </w:rPr>
+        <w:t xml:space="preserve"> to its own MySQL database instance, where:</w:t>
       </w:r>
     </w:p>
     <w:p>
@@ -1583,7 +2328,7 @@
       <w:pPr>
         <w:pStyle w:val="ListParagraph"/>
         <w:numPr>
-          <w:ilvl w:val="0"/>
+          <w:ilvl w:val="1"/>
           <w:numId w:val="13"/>
         </w:numPr>
         <w:rPr>
@@ -1598,65 +2343,25 @@
           <w:sz w:val="24"/>
           <w:szCs w:val="24"/>
         </w:rPr>
-        <w:t>Session and State Management</w:t>
-      </w:r>
-      <w:r>
-        <w:rPr>
-          <w:sz w:val="24"/>
-          <w:szCs w:val="24"/>
-        </w:rPr>
-        <w:t xml:space="preserve">: To optimize resource usage and improve response times, sessions are managed through server-side configurations, while </w:t>
-      </w:r>
-      <w:proofErr w:type="spellStart"/>
-      <w:r>
-        <w:rPr>
-          <w:b/>
-          <w:bCs/>
-          <w:sz w:val="24"/>
-          <w:szCs w:val="24"/>
-        </w:rPr>
-        <w:t>LocalStorage</w:t>
-      </w:r>
-      <w:proofErr w:type="spellEnd"/>
-      <w:r>
-        <w:rPr>
-          <w:sz w:val="24"/>
-          <w:szCs w:val="24"/>
-        </w:rPr>
-        <w:t xml:space="preserve"> is used on the client side to handle temporary data. </w:t>
-      </w:r>
-      <w:r>
-        <w:rPr>
-          <w:b/>
-          <w:bCs/>
-          <w:sz w:val="24"/>
-          <w:szCs w:val="24"/>
-        </w:rPr>
-        <w:t>Spring</w:t>
-      </w:r>
-      <w:r>
-        <w:rPr>
-          <w:sz w:val="24"/>
-          <w:szCs w:val="24"/>
-        </w:rPr>
-        <w:t xml:space="preserve"> manages ORM tasks using </w:t>
-      </w:r>
-      <w:r>
-        <w:rPr>
-          <w:b/>
-          <w:bCs/>
-          <w:sz w:val="24"/>
-          <w:szCs w:val="24"/>
-        </w:rPr>
-        <w:t>Hibernate</w:t>
-      </w:r>
-      <w:r>
-        <w:rPr>
-          <w:sz w:val="24"/>
-          <w:szCs w:val="24"/>
-        </w:rPr>
-        <w:t xml:space="preserve"> for seamless database interactions.</w:t>
-      </w:r>
+        <w:t>Monitoring Database</w:t>
+      </w:r>
+      <w:r>
+        <w:rPr>
+          <w:sz w:val="24"/>
+          <w:szCs w:val="24"/>
+        </w:rPr>
+        <w:t>: Records processed energy consumption data, alert logs, and thresholds for monitoring purposes.</w:t>
+      </w:r>
+    </w:p>
+    <w:p>
+      <w:pPr>
+        <w:pStyle w:val="ListParagraph"/>
+        <w:ind w:left="1440"/>
+        <w:rPr>
+          <w:sz w:val="24"/>
+          <w:szCs w:val="24"/>
+        </w:rPr>
+      </w:pPr>
     </w:p>
     <w:p>
       <w:pPr>
@@ -1668,7 +2373,6 @@
         <w:rPr>
           <w:sz w:val="24"/>
           <w:szCs w:val="24"/>
-          <w:lang w:val="en-GB"/>
         </w:rPr>
       </w:pPr>
       <w:r>
@@ -1677,8 +2381,93 @@
           <w:bCs/>
           <w:sz w:val="24"/>
           <w:szCs w:val="24"/>
+        </w:rPr>
+        <w:t>Session and State Management</w:t>
+      </w:r>
+      <w:r>
+        <w:rPr>
+          <w:sz w:val="24"/>
+          <w:szCs w:val="24"/>
+        </w:rPr>
+        <w:t xml:space="preserve">: To optimize resource usage and improve response times, sessions are managed through server-side configurations, while </w:t>
+      </w:r>
+      <w:proofErr w:type="spellStart"/>
+      <w:r>
+        <w:rPr>
+          <w:b/>
+          <w:bCs/>
+          <w:sz w:val="24"/>
+          <w:szCs w:val="24"/>
+        </w:rPr>
+        <w:t>LocalStorage</w:t>
+      </w:r>
+      <w:proofErr w:type="spellEnd"/>
+      <w:r>
+        <w:rPr>
+          <w:sz w:val="24"/>
+          <w:szCs w:val="24"/>
+        </w:rPr>
+        <w:t xml:space="preserve"> is used on the client side to handle temporary data. </w:t>
+      </w:r>
+      <w:r>
+        <w:rPr>
+          <w:b/>
+          <w:bCs/>
+          <w:sz w:val="24"/>
+          <w:szCs w:val="24"/>
+        </w:rPr>
+        <w:t>Spring</w:t>
+      </w:r>
+      <w:r>
+        <w:rPr>
+          <w:sz w:val="24"/>
+          <w:szCs w:val="24"/>
+        </w:rPr>
+        <w:t xml:space="preserve"> manages ORM tasks using </w:t>
+      </w:r>
+      <w:r>
+        <w:rPr>
+          <w:b/>
+          <w:bCs/>
+          <w:sz w:val="24"/>
+          <w:szCs w:val="24"/>
+        </w:rPr>
+        <w:t>Hibernate</w:t>
+      </w:r>
+      <w:r>
+        <w:rPr>
+          <w:sz w:val="24"/>
+          <w:szCs w:val="24"/>
+        </w:rPr>
+        <w:t xml:space="preserve"> for seamless database interactions.</w:t>
+      </w:r>
+    </w:p>
+    <w:p>
+      <w:pPr>
+        <w:pStyle w:val="ListParagraph"/>
+        <w:rPr>
+          <w:sz w:val="24"/>
+          <w:szCs w:val="24"/>
+        </w:rPr>
+      </w:pPr>
+    </w:p>
+    <w:p>
+      <w:pPr>
+        <w:ind w:left="360"/>
+        <w:rPr>
+          <w:sz w:val="24"/>
+          <w:szCs w:val="24"/>
           <w:lang w:val="en-GB"/>
         </w:rPr>
+      </w:pPr>
+      <w:r>
+        <w:rPr>
+          <w:b/>
+          <w:bCs/>
+          <w:sz w:val="24"/>
+          <w:szCs w:val="24"/>
+          <w:lang w:val="en-GB"/>
+        </w:rPr>
         <w:t>Technology Stack</w:t>
       </w:r>
       <w:r>
@@ -1692,118 +2481,303 @@
     </w:p>
     <w:p>
       <w:pPr>
-        <w:pStyle w:val="ListParagraph"/>
+        <w:numPr>
+          <w:ilvl w:val="0"/>
+          <w:numId w:val="40"/>
+        </w:numPr>
+        <w:spacing w:before="100" w:beforeAutospacing="1" w:after="100" w:afterAutospacing="1" w:line="240" w:lineRule="auto"/>
+      </w:pPr>
+      <w:r>
+        <w:rPr>
+          <w:rStyle w:val="Strong"/>
+        </w:rPr>
+        <w:t>Frontend</w:t>
+      </w:r>
+      <w:r>
+        <w:t>:</w:t>
+      </w:r>
+    </w:p>
+    <w:p>
+      <w:pPr>
         <w:numPr>
           <w:ilvl w:val="1"/>
-          <w:numId w:val="13"/>
+          <w:numId w:val="40"/>
         </w:numPr>
-        <w:rPr>
-          <w:sz w:val="24"/>
-          <w:szCs w:val="24"/>
-        </w:rPr>
-      </w:pPr>
-      <w:r>
-        <w:rPr>
-          <w:i/>
-          <w:iCs/>
-          <w:sz w:val="24"/>
-          <w:szCs w:val="24"/>
-        </w:rPr>
-        <w:t>Frontend</w:t>
-      </w:r>
-      <w:r>
-        <w:rPr>
-          <w:sz w:val="24"/>
-          <w:szCs w:val="24"/>
-        </w:rPr>
-        <w:t>: React, with state management, routing, and component-based architecture.</w:t>
-      </w:r>
-    </w:p>
-    <w:p>
-      <w:pPr>
-        <w:pStyle w:val="ListParagraph"/>
+        <w:spacing w:before="100" w:beforeAutospacing="1" w:after="100" w:afterAutospacing="1" w:line="240" w:lineRule="auto"/>
+      </w:pPr>
+      <w:r>
+        <w:t>React: For building a responsive, component-based user interface.</w:t>
+      </w:r>
+    </w:p>
+    <w:p>
+      <w:pPr>
         <w:numPr>
           <w:ilvl w:val="1"/>
-          <w:numId w:val="13"/>
+          <w:numId w:val="40"/>
         </w:numPr>
-        <w:rPr>
-          <w:sz w:val="24"/>
-          <w:szCs w:val="24"/>
-        </w:rPr>
-      </w:pPr>
-      <w:r>
-        <w:rPr>
-          <w:i/>
-          <w:iCs/>
-          <w:sz w:val="24"/>
-          <w:szCs w:val="24"/>
-        </w:rPr>
-        <w:t>Backends</w:t>
-      </w:r>
-      <w:r>
-        <w:rPr>
-          <w:sz w:val="24"/>
-          <w:szCs w:val="24"/>
-        </w:rPr>
-        <w:t>: Spring Boot-based microservices, REST API, and database integration.</w:t>
-      </w:r>
-    </w:p>
-    <w:p>
-      <w:pPr>
-        <w:pStyle w:val="ListParagraph"/>
+        <w:spacing w:before="100" w:beforeAutospacing="1" w:after="100" w:afterAutospacing="1" w:line="240" w:lineRule="auto"/>
+      </w:pPr>
+      <w:r>
+        <w:rPr>
+          <w:rStyle w:val="Strong"/>
+        </w:rPr>
+        <w:t>React Router</w:t>
+      </w:r>
+      <w:r>
+        <w:t>: Manages client-side routing for seamless navigation.</w:t>
+      </w:r>
+    </w:p>
+    <w:p>
+      <w:pPr>
         <w:numPr>
           <w:ilvl w:val="1"/>
-          <w:numId w:val="13"/>
+          <w:numId w:val="40"/>
         </w:numPr>
-        <w:rPr>
-          <w:sz w:val="24"/>
-          <w:szCs w:val="24"/>
-        </w:rPr>
-      </w:pPr>
-      <w:r>
-        <w:rPr>
-          <w:i/>
-          <w:iCs/>
-          <w:sz w:val="24"/>
-          <w:szCs w:val="24"/>
-        </w:rPr>
-        <w:t>Database</w:t>
-      </w:r>
-      <w:r>
-        <w:rPr>
-          <w:sz w:val="24"/>
-          <w:szCs w:val="24"/>
-        </w:rPr>
-        <w:t>: MySQL, managed separately for each backend.</w:t>
-      </w:r>
-    </w:p>
-    <w:p>
-      <w:pPr>
-        <w:pStyle w:val="ListParagraph"/>
+        <w:spacing w:before="100" w:beforeAutospacing="1" w:after="100" w:afterAutospacing="1" w:line="240" w:lineRule="auto"/>
+      </w:pPr>
+      <w:r>
+        <w:rPr>
+          <w:rStyle w:val="Strong"/>
+        </w:rPr>
+        <w:t>State Management</w:t>
+      </w:r>
+      <w:r>
+        <w:t xml:space="preserve">: Manages local state using </w:t>
+      </w:r>
+      <w:proofErr w:type="spellStart"/>
+      <w:r>
+        <w:t>React's</w:t>
+      </w:r>
+      <w:proofErr w:type="spellEnd"/>
+      <w:r>
+        <w:t xml:space="preserve"> built-in hooks.</w:t>
+      </w:r>
+    </w:p>
+    <w:p>
+      <w:pPr>
         <w:numPr>
           <w:ilvl w:val="1"/>
-          <w:numId w:val="13"/>
+          <w:numId w:val="40"/>
         </w:numPr>
-        <w:rPr>
-          <w:sz w:val="24"/>
-          <w:szCs w:val="24"/>
-        </w:rPr>
-      </w:pPr>
-      <w:r>
-        <w:rPr>
-          <w:i/>
-          <w:iCs/>
-          <w:sz w:val="24"/>
-          <w:szCs w:val="24"/>
+        <w:spacing w:before="100" w:beforeAutospacing="1" w:after="100" w:afterAutospacing="1" w:line="240" w:lineRule="auto"/>
+      </w:pPr>
+      <w:r>
+        <w:rPr>
+          <w:rStyle w:val="Strong"/>
+        </w:rPr>
+        <w:t>Material-UI</w:t>
+      </w:r>
+      <w:r>
+        <w:t>: Provides a visually appealing and consistent design for UI components.</w:t>
+      </w:r>
+    </w:p>
+    <w:p>
+      <w:pPr>
+        <w:numPr>
+          <w:ilvl w:val="0"/>
+          <w:numId w:val="40"/>
+        </w:numPr>
+        <w:spacing w:before="100" w:beforeAutospacing="1" w:after="100" w:afterAutospacing="1" w:line="240" w:lineRule="auto"/>
+      </w:pPr>
+      <w:r>
+        <w:rPr>
+          <w:rStyle w:val="Strong"/>
+        </w:rPr>
+        <w:t>Backends</w:t>
+      </w:r>
+      <w:r>
+        <w:t>:</w:t>
+      </w:r>
+    </w:p>
+    <w:p>
+      <w:pPr>
+        <w:numPr>
+          <w:ilvl w:val="1"/>
+          <w:numId w:val="40"/>
+        </w:numPr>
+        <w:spacing w:before="100" w:beforeAutospacing="1" w:after="100" w:afterAutospacing="1" w:line="240" w:lineRule="auto"/>
+      </w:pPr>
+      <w:r>
+        <w:t>Spring Boot: Used to build robust, RESTful microservices.</w:t>
+      </w:r>
+    </w:p>
+    <w:p>
+      <w:pPr>
+        <w:numPr>
+          <w:ilvl w:val="1"/>
+          <w:numId w:val="40"/>
+        </w:numPr>
+        <w:spacing w:before="100" w:beforeAutospacing="1" w:after="100" w:afterAutospacing="1" w:line="240" w:lineRule="auto"/>
+      </w:pPr>
+      <w:r>
+        <w:rPr>
+          <w:rStyle w:val="Strong"/>
+        </w:rPr>
+        <w:t>REST API</w:t>
+      </w:r>
+      <w:r>
+        <w:t>: Enables communication between the frontends and backends.</w:t>
+      </w:r>
+    </w:p>
+    <w:p>
+      <w:pPr>
+        <w:numPr>
+          <w:ilvl w:val="1"/>
+          <w:numId w:val="40"/>
+        </w:numPr>
+        <w:spacing w:before="100" w:beforeAutospacing="1" w:after="100" w:afterAutospacing="1" w:line="240" w:lineRule="auto"/>
+      </w:pPr>
+      <w:r>
+        <w:rPr>
+          <w:rStyle w:val="Strong"/>
+        </w:rPr>
+        <w:t>RabbitMQ</w:t>
+      </w:r>
+      <w:r>
+        <w:t>: Facilitates asynchronous messaging between the Monitoring and Communication Microservice and smart device simulators.</w:t>
+      </w:r>
+    </w:p>
+    <w:p>
+      <w:pPr>
+        <w:numPr>
+          <w:ilvl w:val="0"/>
+          <w:numId w:val="40"/>
+        </w:numPr>
+        <w:spacing w:before="100" w:beforeAutospacing="1" w:after="100" w:afterAutospacing="1" w:line="240" w:lineRule="auto"/>
+      </w:pPr>
+      <w:r>
+        <w:rPr>
+          <w:rStyle w:val="Strong"/>
+        </w:rPr>
+        <w:t>Database</w:t>
+      </w:r>
+      <w:r>
+        <w:t>:</w:t>
+      </w:r>
+    </w:p>
+    <w:p>
+      <w:pPr>
+        <w:numPr>
+          <w:ilvl w:val="1"/>
+          <w:numId w:val="40"/>
+        </w:numPr>
+        <w:spacing w:before="100" w:beforeAutospacing="1" w:after="100" w:afterAutospacing="1" w:line="240" w:lineRule="auto"/>
+      </w:pPr>
+      <w:r>
+        <w:t>MySQL: Each backend has its own dedicated database for efficient storage and retrieval of data.</w:t>
+      </w:r>
+    </w:p>
+    <w:p>
+      <w:pPr>
+        <w:spacing w:before="100" w:beforeAutospacing="1" w:after="100" w:afterAutospacing="1" w:line="240" w:lineRule="auto"/>
+        <w:ind w:left="1440"/>
+      </w:pPr>
+    </w:p>
+    <w:p>
+      <w:pPr>
+        <w:numPr>
+          <w:ilvl w:val="0"/>
+          <w:numId w:val="40"/>
+        </w:numPr>
+        <w:spacing w:before="100" w:beforeAutospacing="1" w:after="100" w:afterAutospacing="1" w:line="240" w:lineRule="auto"/>
+      </w:pPr>
+      <w:r>
+        <w:rPr>
+          <w:rStyle w:val="Strong"/>
         </w:rPr>
         <w:t>Containerization</w:t>
       </w:r>
       <w:r>
-        <w:rPr>
-          <w:sz w:val="24"/>
-          <w:szCs w:val="24"/>
-        </w:rPr>
-        <w:t>: Docker, enabling an isolated, scalable environment.</w:t>
+        <w:t>:</w:t>
+      </w:r>
+    </w:p>
+    <w:p>
+      <w:pPr>
+        <w:numPr>
+          <w:ilvl w:val="1"/>
+          <w:numId w:val="40"/>
+        </w:numPr>
+        <w:spacing w:before="100" w:beforeAutospacing="1" w:after="100" w:afterAutospacing="1" w:line="240" w:lineRule="auto"/>
+      </w:pPr>
+      <w:r>
+        <w:lastRenderedPageBreak/>
+        <w:t>Docker: Each service, including the frontend, backends, and databases, runs in a Docker container for isolation and scalability.</w:t>
+      </w:r>
+    </w:p>
+    <w:p>
+      <w:pPr>
+        <w:numPr>
+          <w:ilvl w:val="1"/>
+          <w:numId w:val="40"/>
+        </w:numPr>
+        <w:spacing w:before="100" w:beforeAutospacing="1" w:after="100" w:afterAutospacing="1" w:line="240" w:lineRule="auto"/>
+      </w:pPr>
+      <w:r>
+        <w:rPr>
+          <w:rStyle w:val="Strong"/>
+        </w:rPr>
+        <w:t>Docker Compose</w:t>
+      </w:r>
+      <w:r>
+        <w:t>: Manages multi-container deployment and networking between services.</w:t>
+      </w:r>
+    </w:p>
+    <w:p>
+      <w:pPr>
+        <w:spacing w:before="100" w:beforeAutospacing="1" w:after="100" w:afterAutospacing="1" w:line="240" w:lineRule="auto"/>
+        <w:ind w:left="1440"/>
+      </w:pPr>
+    </w:p>
+    <w:p>
+      <w:pPr>
+        <w:pStyle w:val="Heading4"/>
+      </w:pPr>
+      <w:r>
+        <w:t>Additional Tools and Configurations</w:t>
+      </w:r>
+    </w:p>
+    <w:p>
+      <w:pPr>
+        <w:numPr>
+          <w:ilvl w:val="0"/>
+          <w:numId w:val="41"/>
+        </w:numPr>
+        <w:spacing w:before="100" w:beforeAutospacing="1" w:after="100" w:afterAutospacing="1" w:line="240" w:lineRule="auto"/>
+      </w:pPr>
+      <w:r>
+        <w:rPr>
+          <w:rStyle w:val="Strong"/>
+        </w:rPr>
+        <w:t>WebSocket</w:t>
+      </w:r>
+      <w:r>
+        <w:t>: Enables real-time notifications from the Monitoring and Communication Microservice to the client application.</w:t>
+      </w:r>
+    </w:p>
+    <w:p>
+      <w:pPr>
+        <w:numPr>
+          <w:ilvl w:val="0"/>
+          <w:numId w:val="41"/>
+        </w:numPr>
+        <w:spacing w:before="100" w:beforeAutospacing="1" w:after="100" w:afterAutospacing="1" w:line="240" w:lineRule="auto"/>
+      </w:pPr>
+      <w:r>
+        <w:rPr>
+          <w:rStyle w:val="Strong"/>
+        </w:rPr>
+        <w:t>Reverse Proxy</w:t>
+      </w:r>
+      <w:r>
+        <w:t xml:space="preserve">: </w:t>
+      </w:r>
+      <w:proofErr w:type="gramStart"/>
+      <w:r>
+        <w:t>An</w:t>
+      </w:r>
+      <w:proofErr w:type="gramEnd"/>
+      <w:r>
+        <w:t xml:space="preserve"> NGINX-based reverse proxy is used for load balancing and traffic distribution among backend instances.</w:t>
       </w:r>
     </w:p>
     <w:p>
@@ -2080,7 +3054,6 @@
           <w:sz w:val="24"/>
           <w:szCs w:val="24"/>
         </w:rPr>
-        <w:lastRenderedPageBreak/>
         <w:t>Complexity</w:t>
       </w:r>
       <w:r>
@@ -2168,6 +3141,46 @@
     </w:p>
     <w:p>
       <w:pPr>
+        <w:spacing w:before="100" w:beforeAutospacing="1" w:after="100" w:afterAutospacing="1" w:line="240" w:lineRule="auto"/>
+        <w:rPr>
+          <w:rFonts w:eastAsia="Times New Roman" w:cstheme="minorHAnsi"/>
+          <w:sz w:val="24"/>
+          <w:szCs w:val="24"/>
+        </w:rPr>
+      </w:pPr>
+    </w:p>
+    <w:p>
+      <w:pPr>
+        <w:spacing w:before="100" w:beforeAutospacing="1" w:after="100" w:afterAutospacing="1" w:line="240" w:lineRule="auto"/>
+        <w:rPr>
+          <w:rFonts w:eastAsia="Times New Roman" w:cstheme="minorHAnsi"/>
+          <w:sz w:val="24"/>
+          <w:szCs w:val="24"/>
+        </w:rPr>
+      </w:pPr>
+    </w:p>
+    <w:p>
+      <w:pPr>
+        <w:spacing w:before="100" w:beforeAutospacing="1" w:after="100" w:afterAutospacing="1" w:line="240" w:lineRule="auto"/>
+        <w:rPr>
+          <w:rFonts w:eastAsia="Times New Roman" w:cstheme="minorHAnsi"/>
+          <w:sz w:val="24"/>
+          <w:szCs w:val="24"/>
+        </w:rPr>
+      </w:pPr>
+    </w:p>
+    <w:p>
+      <w:pPr>
+        <w:spacing w:before="100" w:beforeAutospacing="1" w:after="100" w:afterAutospacing="1" w:line="240" w:lineRule="auto"/>
+        <w:rPr>
+          <w:rFonts w:eastAsia="Times New Roman" w:cstheme="minorHAnsi"/>
+          <w:sz w:val="24"/>
+          <w:szCs w:val="24"/>
+        </w:rPr>
+      </w:pPr>
+    </w:p>
+    <w:p>
+      <w:pPr>
         <w:pStyle w:val="Heading1"/>
         <w:numPr>
           <w:ilvl w:val="0"/>
@@ -2336,7 +3349,23 @@
           <w:sz w:val="24"/>
           <w:szCs w:val="24"/>
         </w:rPr>
-        <w:t>Controllers: These expose the REST API endpoints and serve as the entry points for client requests.</w:t>
+        <w:t xml:space="preserve">Controllers: These expose the REST API endpoints and serve as </w:t>
+      </w:r>
+      <w:proofErr w:type="gramStart"/>
+      <w:r>
+        <w:rPr>
+          <w:sz w:val="24"/>
+          <w:szCs w:val="24"/>
+        </w:rPr>
+        <w:t>the entry</w:t>
+      </w:r>
+      <w:proofErr w:type="gramEnd"/>
+      <w:r>
+        <w:rPr>
+          <w:sz w:val="24"/>
+          <w:szCs w:val="24"/>
+        </w:rPr>
+        <w:t xml:space="preserve"> points for client requests.</w:t>
       </w:r>
     </w:p>
     <w:p>
@@ -2479,7 +3508,6 @@
           <w:sz w:val="24"/>
           <w:szCs w:val="24"/>
         </w:rPr>
-        <w:lastRenderedPageBreak/>
         <w:t>Containers enable consistent deployment across environments and simplify scaling and updating of individual services.</w:t>
       </w:r>
     </w:p>
@@ -2499,6 +3527,7 @@
           <w:sz w:val="24"/>
           <w:szCs w:val="24"/>
         </w:rPr>
+        <w:lastRenderedPageBreak/>
         <w:t>A shared network (via Docker Compose) allows seamless communication between containers, while environment variables control database credentials, IPs, and ports.</w:t>
       </w:r>
     </w:p>
@@ -2573,7 +3602,23 @@
           <w:sz w:val="24"/>
           <w:szCs w:val="24"/>
         </w:rPr>
-        <w:t>Each controller class acts as an API layer, responsible for receiving HTTP requests from the frontend and returning responses.</w:t>
+        <w:t xml:space="preserve">Each controller class acts as an API layer, responsible for receiving HTTP requests from the </w:t>
+      </w:r>
+      <w:proofErr w:type="gramStart"/>
+      <w:r>
+        <w:rPr>
+          <w:sz w:val="24"/>
+          <w:szCs w:val="24"/>
+        </w:rPr>
+        <w:t>frontend</w:t>
+      </w:r>
+      <w:proofErr w:type="gramEnd"/>
+      <w:r>
+        <w:rPr>
+          <w:sz w:val="24"/>
+          <w:szCs w:val="24"/>
+        </w:rPr>
+        <w:t xml:space="preserve"> and returning responses.</w:t>
       </w:r>
     </w:p>
     <w:p>
@@ -3023,6 +4068,9 @@
         <w:t xml:space="preserve">        </w:t>
       </w:r>
       <w:r>
+        <w:rPr>
+          <w:noProof/>
+        </w:rPr>
         <w:drawing>
           <wp:inline distT="0" distB="0" distL="0" distR="0" wp14:anchorId="3A48A701" wp14:editId="103BB519">
             <wp:extent cx="4518660" cy="2053190"/>
@@ -3376,10 +4424,7 @@
         </w:drawing>
       </w:r>
       <w:r>
-        <w:t>User</w:t>
-      </w:r>
-      <w:r>
-        <w:t xml:space="preserve"> Backend UML diagr</w:t>
+        <w:t>User Backend UML diagr</w:t>
       </w:r>
       <w:r>
         <w:t>am</w:t>
@@ -3422,11 +4467,13 @@
       </w:pPr>
       <w:r>
         <w:lastRenderedPageBreak/>
-        <w:t>Docker Configurations</w:t>
-      </w:r>
-      <w:r>
-        <w:t xml:space="preserve"> :</w:t>
-      </w:r>
+        <w:t xml:space="preserve">Docker </w:t>
+      </w:r>
+      <w:proofErr w:type="gramStart"/>
+      <w:r>
+        <w:t>Configurations :</w:t>
+      </w:r>
+      <w:proofErr w:type="gramEnd"/>
     </w:p>
     <w:p>
       <w:pPr>
@@ -3519,7 +4566,25 @@
           <w:sz w:val="24"/>
           <w:szCs w:val="24"/>
         </w:rPr>
-        <w:t xml:space="preserve">: Each backend and frontend component has a specific </w:t>
+        <w:t xml:space="preserve">: Each backend and frontend component </w:t>
+      </w:r>
+      <w:proofErr w:type="gramStart"/>
+      <w:r>
+        <w:rPr>
+          <w:rFonts w:cstheme="minorHAnsi"/>
+          <w:sz w:val="24"/>
+          <w:szCs w:val="24"/>
+        </w:rPr>
+        <w:t>has</w:t>
+      </w:r>
+      <w:proofErr w:type="gramEnd"/>
+      <w:r>
+        <w:rPr>
+          <w:rFonts w:cstheme="minorHAnsi"/>
+          <w:sz w:val="24"/>
+          <w:szCs w:val="24"/>
+        </w:rPr>
+        <w:t xml:space="preserve"> a specific </w:t>
       </w:r>
       <w:proofErr w:type="spellStart"/>
       <w:r>
@@ -5001,7 +6066,25 @@
           <w:sz w:val="24"/>
           <w:szCs w:val="24"/>
         </w:rPr>
-        <w:t xml:space="preserve">: Builds the frontend service from the </w:t>
+        <w:t xml:space="preserve">: Builds the </w:t>
+      </w:r>
+      <w:proofErr w:type="gramStart"/>
+      <w:r>
+        <w:rPr>
+          <w:rFonts w:cstheme="minorHAnsi"/>
+          <w:sz w:val="24"/>
+          <w:szCs w:val="24"/>
+        </w:rPr>
+        <w:t>frontend</w:t>
+      </w:r>
+      <w:proofErr w:type="gramEnd"/>
+      <w:r>
+        <w:rPr>
+          <w:rFonts w:cstheme="minorHAnsi"/>
+          <w:sz w:val="24"/>
+          <w:szCs w:val="24"/>
+        </w:rPr>
+        <w:t xml:space="preserve"> service from the </w:t>
       </w:r>
       <w:proofErr w:type="spellStart"/>
       <w:r>
@@ -5420,7 +6503,16 @@
           <w:sz w:val="24"/>
           <w:szCs w:val="24"/>
         </w:rPr>
-        <w:t>: Copies package*.</w:t>
+        <w:t>: Copies package</w:t>
+      </w:r>
+      <w:proofErr w:type="gramStart"/>
+      <w:r>
+        <w:rPr>
+          <w:rFonts w:cstheme="minorHAnsi"/>
+          <w:sz w:val="24"/>
+          <w:szCs w:val="24"/>
+        </w:rPr>
+        <w:t>*.</w:t>
       </w:r>
       <w:proofErr w:type="spellStart"/>
       <w:r>
@@ -5432,6 +6524,7 @@
         <w:t>json</w:t>
       </w:r>
       <w:proofErr w:type="spellEnd"/>
+      <w:proofErr w:type="gramEnd"/>
       <w:r>
         <w:rPr>
           <w:rFonts w:cstheme="minorHAnsi"/>
@@ -5469,7 +6562,25 @@
           <w:sz w:val="24"/>
           <w:szCs w:val="24"/>
         </w:rPr>
-        <w:t>: Exposes port 3000 for the frontend server.</w:t>
+        <w:t xml:space="preserve">: Exposes port 3000 for the </w:t>
+      </w:r>
+      <w:proofErr w:type="gramStart"/>
+      <w:r>
+        <w:rPr>
+          <w:rFonts w:cstheme="minorHAnsi"/>
+          <w:sz w:val="24"/>
+          <w:szCs w:val="24"/>
+        </w:rPr>
+        <w:t>frontend</w:t>
+      </w:r>
+      <w:proofErr w:type="gramEnd"/>
+      <w:r>
+        <w:rPr>
+          <w:rFonts w:cstheme="minorHAnsi"/>
+          <w:sz w:val="24"/>
+          <w:szCs w:val="24"/>
+        </w:rPr>
+        <w:t xml:space="preserve"> server.</w:t>
       </w:r>
     </w:p>
     <w:p>
@@ -5599,6 +6710,7 @@
       <w:r>
         <w:rPr>
           <w:rFonts w:cstheme="minorHAnsi"/>
+          <w:noProof/>
           <w:sz w:val="24"/>
           <w:szCs w:val="24"/>
         </w:rPr>
@@ -5684,8 +6796,1187 @@
     <w:p>
       <w:pPr>
         <w:pStyle w:val="Heading1"/>
+        <w:numPr>
+          <w:ilvl w:val="0"/>
+          <w:numId w:val="1"/>
+        </w:numPr>
+      </w:pPr>
+      <w:bookmarkStart w:id="3" w:name="_Hlk183515626"/>
+      <w:r>
+        <w:lastRenderedPageBreak/>
+        <w:t xml:space="preserve">Configuration </w:t>
+      </w:r>
+      <w:r>
+        <w:t>of RabbitMQ</w:t>
+      </w:r>
+    </w:p>
+    <w:bookmarkEnd w:id="3"/>
+    <w:p>
+      <w:pPr>
+        <w:spacing w:before="100" w:beforeAutospacing="1" w:after="100" w:afterAutospacing="1" w:line="240" w:lineRule="auto"/>
+        <w:rPr>
+          <w:rFonts w:ascii="Times New Roman" w:eastAsia="Times New Roman" w:hAnsi="Times New Roman" w:cs="Times New Roman"/>
+          <w:sz w:val="24"/>
+          <w:szCs w:val="24"/>
+        </w:rPr>
+      </w:pPr>
+      <w:r>
+        <w:rPr>
+          <w:rFonts w:ascii="Times New Roman" w:eastAsia="Times New Roman" w:hAnsi="Times New Roman" w:cs="Times New Roman"/>
+          <w:sz w:val="24"/>
+          <w:szCs w:val="24"/>
+        </w:rPr>
+        <w:t xml:space="preserve">RabbitMQ is used as a </w:t>
+      </w:r>
+      <w:r>
+        <w:rPr>
+          <w:rFonts w:ascii="Times New Roman" w:eastAsia="Times New Roman" w:hAnsi="Times New Roman" w:cs="Times New Roman"/>
+          <w:b/>
+          <w:bCs/>
+          <w:sz w:val="24"/>
+          <w:szCs w:val="24"/>
+        </w:rPr>
+        <w:t>Message Broker</w:t>
+      </w:r>
+      <w:r>
+        <w:rPr>
+          <w:rFonts w:ascii="Times New Roman" w:eastAsia="Times New Roman" w:hAnsi="Times New Roman" w:cs="Times New Roman"/>
+          <w:sz w:val="24"/>
+          <w:szCs w:val="24"/>
+        </w:rPr>
+        <w:t>, enabling asynchronous communication between the device simulator and the monitoring microservice.</w:t>
+      </w:r>
+    </w:p>
+    <w:p>
+      <w:pPr>
+        <w:numPr>
+          <w:ilvl w:val="0"/>
+          <w:numId w:val="42"/>
+        </w:numPr>
+        <w:spacing w:before="100" w:beforeAutospacing="1" w:after="100" w:afterAutospacing="1" w:line="240" w:lineRule="auto"/>
+        <w:rPr>
+          <w:rFonts w:ascii="Times New Roman" w:eastAsia="Times New Roman" w:hAnsi="Times New Roman" w:cs="Times New Roman"/>
+          <w:sz w:val="24"/>
+          <w:szCs w:val="24"/>
+        </w:rPr>
+      </w:pPr>
+      <w:r>
+        <w:rPr>
+          <w:rFonts w:ascii="Times New Roman" w:eastAsia="Times New Roman" w:hAnsi="Times New Roman" w:cs="Times New Roman"/>
+          <w:b/>
+          <w:bCs/>
+          <w:sz w:val="24"/>
+          <w:szCs w:val="24"/>
+        </w:rPr>
+        <w:t>Message Production</w:t>
+      </w:r>
+      <w:r>
+        <w:rPr>
+          <w:rFonts w:ascii="Times New Roman" w:eastAsia="Times New Roman" w:hAnsi="Times New Roman" w:cs="Times New Roman"/>
+          <w:sz w:val="24"/>
+          <w:szCs w:val="24"/>
+        </w:rPr>
+        <w:t xml:space="preserve">: The simulator sends data as JSON messages to a RabbitMQ </w:t>
+      </w:r>
+      <w:r>
+        <w:rPr>
+          <w:rFonts w:ascii="Times New Roman" w:eastAsia="Times New Roman" w:hAnsi="Times New Roman" w:cs="Times New Roman"/>
+          <w:b/>
+          <w:bCs/>
+          <w:sz w:val="24"/>
+          <w:szCs w:val="24"/>
+        </w:rPr>
+        <w:t>queue</w:t>
+      </w:r>
+      <w:r>
+        <w:rPr>
+          <w:rFonts w:ascii="Times New Roman" w:eastAsia="Times New Roman" w:hAnsi="Times New Roman" w:cs="Times New Roman"/>
+          <w:sz w:val="24"/>
+          <w:szCs w:val="24"/>
+        </w:rPr>
+        <w:t xml:space="preserve"> using a publish/subscribe mechanism.</w:t>
+      </w:r>
+    </w:p>
+    <w:p>
+      <w:pPr>
+        <w:numPr>
+          <w:ilvl w:val="0"/>
+          <w:numId w:val="42"/>
+        </w:numPr>
+        <w:spacing w:before="100" w:beforeAutospacing="1" w:after="100" w:afterAutospacing="1" w:line="240" w:lineRule="auto"/>
+        <w:rPr>
+          <w:rFonts w:ascii="Times New Roman" w:eastAsia="Times New Roman" w:hAnsi="Times New Roman" w:cs="Times New Roman"/>
+          <w:sz w:val="24"/>
+          <w:szCs w:val="24"/>
+        </w:rPr>
+      </w:pPr>
+      <w:r>
+        <w:rPr>
+          <w:rFonts w:ascii="Times New Roman" w:eastAsia="Times New Roman" w:hAnsi="Times New Roman" w:cs="Times New Roman"/>
+          <w:b/>
+          <w:bCs/>
+          <w:sz w:val="24"/>
+          <w:szCs w:val="24"/>
+        </w:rPr>
+        <w:t>Message Consumption</w:t>
+      </w:r>
+      <w:r>
+        <w:rPr>
+          <w:rFonts w:ascii="Times New Roman" w:eastAsia="Times New Roman" w:hAnsi="Times New Roman" w:cs="Times New Roman"/>
+          <w:sz w:val="24"/>
+          <w:szCs w:val="24"/>
+        </w:rPr>
+        <w:t xml:space="preserve">: The Monitoring and Communication Microservice listens to this </w:t>
+      </w:r>
+      <w:r>
+        <w:rPr>
+          <w:rFonts w:ascii="Times New Roman" w:eastAsia="Times New Roman" w:hAnsi="Times New Roman" w:cs="Times New Roman"/>
+          <w:b/>
+          <w:bCs/>
+          <w:sz w:val="24"/>
+          <w:szCs w:val="24"/>
+        </w:rPr>
+        <w:t>queue</w:t>
+      </w:r>
+      <w:r>
+        <w:rPr>
+          <w:rFonts w:ascii="Times New Roman" w:eastAsia="Times New Roman" w:hAnsi="Times New Roman" w:cs="Times New Roman"/>
+          <w:sz w:val="24"/>
+          <w:szCs w:val="24"/>
+        </w:rPr>
+        <w:t xml:space="preserve"> and processes the messages in real-time.</w:t>
+      </w:r>
+    </w:p>
+    <w:p>
+      <w:pPr>
+        <w:spacing w:before="100" w:beforeAutospacing="1" w:after="100" w:afterAutospacing="1" w:line="240" w:lineRule="auto"/>
+        <w:rPr>
+          <w:rFonts w:ascii="Times New Roman" w:eastAsia="Times New Roman" w:hAnsi="Times New Roman" w:cs="Times New Roman"/>
+          <w:sz w:val="24"/>
+          <w:szCs w:val="24"/>
+        </w:rPr>
+      </w:pPr>
+      <w:r>
+        <w:rPr>
+          <w:rFonts w:ascii="Times New Roman" w:eastAsia="Times New Roman" w:hAnsi="Times New Roman" w:cs="Times New Roman"/>
+          <w:sz w:val="24"/>
+          <w:szCs w:val="24"/>
+        </w:rPr>
+        <w:t>RabbitMQ ensures scalability and efficiency by delivering messages in order and without loss, even under high data volume.</w:t>
+      </w:r>
+    </w:p>
+    <w:p>
+      <w:pPr>
+        <w:spacing w:before="100" w:beforeAutospacing="1" w:after="100" w:afterAutospacing="1" w:line="240" w:lineRule="auto"/>
+        <w:outlineLvl w:val="3"/>
+        <w:rPr>
+          <w:rFonts w:ascii="Times New Roman" w:eastAsia="Times New Roman" w:hAnsi="Times New Roman" w:cs="Times New Roman"/>
+          <w:b/>
+          <w:bCs/>
+          <w:sz w:val="24"/>
+          <w:szCs w:val="24"/>
+        </w:rPr>
+      </w:pPr>
+      <w:r>
+        <w:rPr>
+          <w:rFonts w:ascii="Times New Roman" w:eastAsia="Times New Roman" w:hAnsi="Times New Roman" w:cs="Times New Roman"/>
+          <w:b/>
+          <w:bCs/>
+          <w:sz w:val="24"/>
+          <w:szCs w:val="24"/>
+        </w:rPr>
+        <w:t>RabbitMQ Configuration in the Project:</w:t>
+      </w:r>
+    </w:p>
+    <w:p>
+      <w:pPr>
+        <w:numPr>
+          <w:ilvl w:val="0"/>
+          <w:numId w:val="43"/>
+        </w:numPr>
+        <w:spacing w:before="100" w:beforeAutospacing="1" w:after="100" w:afterAutospacing="1" w:line="240" w:lineRule="auto"/>
+        <w:rPr>
+          <w:rFonts w:ascii="Times New Roman" w:eastAsia="Times New Roman" w:hAnsi="Times New Roman" w:cs="Times New Roman"/>
+          <w:sz w:val="24"/>
+          <w:szCs w:val="24"/>
+        </w:rPr>
+      </w:pPr>
+      <w:r>
+        <w:rPr>
+          <w:rFonts w:ascii="Times New Roman" w:eastAsia="Times New Roman" w:hAnsi="Times New Roman" w:cs="Times New Roman"/>
+          <w:b/>
+          <w:bCs/>
+          <w:sz w:val="24"/>
+          <w:szCs w:val="24"/>
+        </w:rPr>
+        <w:t>Queue</w:t>
+      </w:r>
+      <w:r>
+        <w:rPr>
+          <w:rFonts w:ascii="Times New Roman" w:eastAsia="Times New Roman" w:hAnsi="Times New Roman" w:cs="Times New Roman"/>
+          <w:sz w:val="24"/>
+          <w:szCs w:val="24"/>
+        </w:rPr>
+        <w:t>: The queue name is configured as an environment variable.</w:t>
+      </w:r>
+    </w:p>
+    <w:p>
+      <w:pPr>
+        <w:numPr>
+          <w:ilvl w:val="0"/>
+          <w:numId w:val="43"/>
+        </w:numPr>
+        <w:spacing w:before="100" w:beforeAutospacing="1" w:after="100" w:afterAutospacing="1" w:line="240" w:lineRule="auto"/>
+        <w:rPr>
+          <w:rFonts w:ascii="Times New Roman" w:eastAsia="Times New Roman" w:hAnsi="Times New Roman" w:cs="Times New Roman"/>
+          <w:sz w:val="24"/>
+          <w:szCs w:val="24"/>
+        </w:rPr>
+      </w:pPr>
+      <w:r>
+        <w:rPr>
+          <w:rFonts w:ascii="Times New Roman" w:eastAsia="Times New Roman" w:hAnsi="Times New Roman" w:cs="Times New Roman"/>
+          <w:b/>
+          <w:bCs/>
+          <w:sz w:val="24"/>
+          <w:szCs w:val="24"/>
+        </w:rPr>
+        <w:t>Exchange</w:t>
+      </w:r>
+      <w:r>
+        <w:rPr>
+          <w:rFonts w:ascii="Times New Roman" w:eastAsia="Times New Roman" w:hAnsi="Times New Roman" w:cs="Times New Roman"/>
+          <w:sz w:val="24"/>
+          <w:szCs w:val="24"/>
+        </w:rPr>
+        <w:t xml:space="preserve">: The system can use either a </w:t>
+      </w:r>
+      <w:r>
+        <w:rPr>
+          <w:rFonts w:ascii="Times New Roman" w:eastAsia="Times New Roman" w:hAnsi="Times New Roman" w:cs="Times New Roman"/>
+          <w:b/>
+          <w:bCs/>
+          <w:sz w:val="24"/>
+          <w:szCs w:val="24"/>
+        </w:rPr>
+        <w:t>direct</w:t>
+      </w:r>
+      <w:r>
+        <w:rPr>
+          <w:rFonts w:ascii="Times New Roman" w:eastAsia="Times New Roman" w:hAnsi="Times New Roman" w:cs="Times New Roman"/>
+          <w:sz w:val="24"/>
+          <w:szCs w:val="24"/>
+        </w:rPr>
+        <w:t xml:space="preserve"> or </w:t>
+      </w:r>
+      <w:r>
+        <w:rPr>
+          <w:rFonts w:ascii="Times New Roman" w:eastAsia="Times New Roman" w:hAnsi="Times New Roman" w:cs="Times New Roman"/>
+          <w:b/>
+          <w:bCs/>
+          <w:sz w:val="24"/>
+          <w:szCs w:val="24"/>
+        </w:rPr>
+        <w:t>topic</w:t>
+      </w:r>
+      <w:r>
+        <w:rPr>
+          <w:rFonts w:ascii="Times New Roman" w:eastAsia="Times New Roman" w:hAnsi="Times New Roman" w:cs="Times New Roman"/>
+          <w:sz w:val="24"/>
+          <w:szCs w:val="24"/>
+        </w:rPr>
+        <w:t xml:space="preserve"> exchange to control the flow of messages.</w:t>
+      </w:r>
+    </w:p>
+    <w:p>
+      <w:pPr>
+        <w:numPr>
+          <w:ilvl w:val="0"/>
+          <w:numId w:val="43"/>
+        </w:numPr>
+        <w:spacing w:before="100" w:beforeAutospacing="1" w:after="100" w:afterAutospacing="1" w:line="240" w:lineRule="auto"/>
+        <w:rPr>
+          <w:rFonts w:ascii="Times New Roman" w:eastAsia="Times New Roman" w:hAnsi="Times New Roman" w:cs="Times New Roman"/>
+          <w:sz w:val="24"/>
+          <w:szCs w:val="24"/>
+        </w:rPr>
+      </w:pPr>
+      <w:r>
+        <w:rPr>
+          <w:rFonts w:ascii="Times New Roman" w:eastAsia="Times New Roman" w:hAnsi="Times New Roman" w:cs="Times New Roman"/>
+          <w:b/>
+          <w:bCs/>
+          <w:sz w:val="24"/>
+          <w:szCs w:val="24"/>
+        </w:rPr>
+        <w:t>Durability</w:t>
+      </w:r>
+      <w:r>
+        <w:rPr>
+          <w:rFonts w:ascii="Times New Roman" w:eastAsia="Times New Roman" w:hAnsi="Times New Roman" w:cs="Times New Roman"/>
+          <w:sz w:val="24"/>
+          <w:szCs w:val="24"/>
+        </w:rPr>
+        <w:t>: The queues are persistent to prevent message loss in case of unexpected system failures.</w:t>
+      </w:r>
+    </w:p>
+    <w:p>
+      <w:pPr>
+        <w:spacing w:before="100" w:beforeAutospacing="1" w:after="100" w:afterAutospacing="1"/>
         <w:ind w:left="720"/>
-      </w:pPr>
+        <w:rPr>
+          <w:rFonts w:ascii="Times New Roman" w:eastAsia="Times New Roman" w:hAnsi="Times New Roman" w:cs="Times New Roman"/>
+          <w:sz w:val="24"/>
+          <w:szCs w:val="24"/>
+        </w:rPr>
+      </w:pPr>
+      <w:r>
+        <w:rPr>
+          <w:rFonts w:ascii="Times New Roman" w:eastAsia="Times New Roman" w:hAnsi="Times New Roman" w:cs="Times New Roman"/>
+          <w:b/>
+          <w:bCs/>
+          <w:sz w:val="24"/>
+          <w:szCs w:val="24"/>
+        </w:rPr>
+        <w:t xml:space="preserve">Queues </w:t>
+      </w:r>
+      <w:proofErr w:type="gramStart"/>
+      <w:r>
+        <w:rPr>
+          <w:rFonts w:ascii="Times New Roman" w:eastAsia="Times New Roman" w:hAnsi="Times New Roman" w:cs="Times New Roman"/>
+          <w:b/>
+          <w:bCs/>
+          <w:sz w:val="24"/>
+          <w:szCs w:val="24"/>
+        </w:rPr>
+        <w:t xml:space="preserve">defined </w:t>
+      </w:r>
+      <w:r>
+        <w:rPr>
+          <w:rFonts w:ascii="Times New Roman" w:eastAsia="Times New Roman" w:hAnsi="Times New Roman" w:cs="Times New Roman"/>
+          <w:sz w:val="24"/>
+          <w:szCs w:val="24"/>
+        </w:rPr>
+        <w:t>:</w:t>
+      </w:r>
+      <w:proofErr w:type="gramEnd"/>
+      <w:r>
+        <w:rPr>
+          <w:rFonts w:ascii="Times New Roman" w:eastAsia="Times New Roman" w:hAnsi="Times New Roman" w:cs="Times New Roman"/>
+          <w:sz w:val="24"/>
+          <w:szCs w:val="24"/>
+        </w:rPr>
+        <w:t xml:space="preserve"> </w:t>
+      </w:r>
+    </w:p>
+    <w:p>
+      <w:pPr>
+        <w:spacing w:before="100" w:beforeAutospacing="1" w:after="100" w:afterAutospacing="1"/>
+        <w:ind w:left="720"/>
+        <w:rPr>
+          <w:rFonts w:ascii="Times New Roman" w:eastAsia="Times New Roman" w:hAnsi="Times New Roman" w:cs="Times New Roman"/>
+          <w:sz w:val="24"/>
+          <w:szCs w:val="24"/>
+        </w:rPr>
+      </w:pPr>
+      <w:r>
+        <w:rPr>
+          <w:rFonts w:ascii="Times New Roman" w:eastAsia="Times New Roman" w:hAnsi="Times New Roman" w:cs="Times New Roman"/>
+          <w:sz w:val="24"/>
+          <w:szCs w:val="24"/>
+        </w:rPr>
+        <w:t>DEVICE_CHANGE_QUEUE = "device-change-queue";</w:t>
+      </w:r>
+      <w:r>
+        <w:rPr>
+          <w:rFonts w:ascii="Times New Roman" w:eastAsia="Times New Roman" w:hAnsi="Times New Roman" w:cs="Times New Roman"/>
+          <w:sz w:val="24"/>
+          <w:szCs w:val="24"/>
+        </w:rPr>
+        <w:br/>
+        <w:t>USER_CHANGE_QUEUE = "user-change-queue";</w:t>
+      </w:r>
+      <w:r>
+        <w:rPr>
+          <w:rFonts w:ascii="Times New Roman" w:eastAsia="Times New Roman" w:hAnsi="Times New Roman" w:cs="Times New Roman"/>
+          <w:sz w:val="24"/>
+          <w:szCs w:val="24"/>
+        </w:rPr>
+        <w:br/>
+        <w:t>ENERGY_CHANGE_QUEUE = "energy-measurements</w:t>
+      </w:r>
+      <w:proofErr w:type="gramStart"/>
+      <w:r>
+        <w:rPr>
+          <w:rFonts w:ascii="Times New Roman" w:eastAsia="Times New Roman" w:hAnsi="Times New Roman" w:cs="Times New Roman"/>
+          <w:sz w:val="24"/>
+          <w:szCs w:val="24"/>
+        </w:rPr>
+        <w:t>";</w:t>
+      </w:r>
+      <w:proofErr w:type="gramEnd"/>
+    </w:p>
+    <w:p/>
+    <w:p>
+      <w:pPr>
+        <w:pStyle w:val="ListParagraph"/>
+        <w:numPr>
+          <w:ilvl w:val="0"/>
+          <w:numId w:val="1"/>
+        </w:numPr>
+        <w:rPr>
+          <w:b/>
+          <w:bCs/>
+          <w:sz w:val="32"/>
+          <w:szCs w:val="32"/>
+        </w:rPr>
+      </w:pPr>
+      <w:proofErr w:type="spellStart"/>
+      <w:r>
+        <w:rPr>
+          <w:b/>
+          <w:bCs/>
+          <w:sz w:val="32"/>
+          <w:szCs w:val="32"/>
+        </w:rPr>
+        <w:t>Traefik</w:t>
+      </w:r>
+      <w:proofErr w:type="spellEnd"/>
+      <w:r>
+        <w:rPr>
+          <w:b/>
+          <w:bCs/>
+          <w:sz w:val="32"/>
+          <w:szCs w:val="32"/>
+        </w:rPr>
+        <w:t xml:space="preserve"> Configuration</w:t>
+      </w:r>
+    </w:p>
+    <w:p>
+      <w:pPr>
+        <w:pStyle w:val="Heading3"/>
+      </w:pPr>
+      <w:r>
+        <w:t>Load Balancing with Reverse Proxy</w:t>
+      </w:r>
+    </w:p>
+    <w:p>
+      <w:pPr>
+        <w:pStyle w:val="NormalWeb"/>
+      </w:pPr>
+      <w:r>
+        <w:rPr>
+          <w:rStyle w:val="Strong"/>
+        </w:rPr>
+        <w:t>Load balancing</w:t>
+      </w:r>
+      <w:r>
+        <w:t xml:space="preserve"> is implemented to distribute incoming requests evenly across multiple instances of the monitoring microservice. This improves system performance, ensuring high availability and reduced response times.</w:t>
+      </w:r>
+    </w:p>
+    <w:p>
+      <w:pPr>
+        <w:pStyle w:val="Heading4"/>
+      </w:pPr>
+      <w:r>
+        <w:t>Using a Reverse Proxy:</w:t>
+      </w:r>
+    </w:p>
+    <w:p>
+      <w:pPr>
+        <w:numPr>
+          <w:ilvl w:val="0"/>
+          <w:numId w:val="44"/>
+        </w:numPr>
+        <w:spacing w:before="100" w:beforeAutospacing="1" w:after="100" w:afterAutospacing="1" w:line="240" w:lineRule="auto"/>
+      </w:pPr>
+      <w:r>
+        <w:rPr>
+          <w:rStyle w:val="Strong"/>
+        </w:rPr>
+        <w:t>C</w:t>
+      </w:r>
+      <w:r>
+        <w:t>onfigured as a reverse proxy to intercept client requests.</w:t>
+      </w:r>
+    </w:p>
+    <w:p>
+      <w:pPr>
+        <w:numPr>
+          <w:ilvl w:val="0"/>
+          <w:numId w:val="44"/>
+        </w:numPr>
+        <w:spacing w:before="100" w:beforeAutospacing="1" w:after="100" w:afterAutospacing="1" w:line="240" w:lineRule="auto"/>
+      </w:pPr>
+      <w:r>
+        <w:rPr>
+          <w:rStyle w:val="Strong"/>
+        </w:rPr>
+        <w:t>Traffic Distribution</w:t>
+      </w:r>
+      <w:r>
+        <w:t xml:space="preserve">: The reverse proxy uses algorithms such as </w:t>
+      </w:r>
+      <w:r>
+        <w:rPr>
+          <w:rStyle w:val="Strong"/>
+        </w:rPr>
+        <w:t>round-robin</w:t>
+      </w:r>
+      <w:r>
+        <w:t xml:space="preserve"> or </w:t>
+      </w:r>
+      <w:r>
+        <w:rPr>
+          <w:rStyle w:val="Strong"/>
+        </w:rPr>
+        <w:t>least connections</w:t>
+      </w:r>
+      <w:r>
+        <w:t xml:space="preserve"> to forward requests to available instances.</w:t>
+      </w:r>
+    </w:p>
+    <w:p>
+      <w:pPr>
+        <w:numPr>
+          <w:ilvl w:val="0"/>
+          <w:numId w:val="44"/>
+        </w:numPr>
+        <w:spacing w:before="100" w:beforeAutospacing="1" w:after="100" w:afterAutospacing="1" w:line="240" w:lineRule="auto"/>
+      </w:pPr>
+      <w:r>
+        <w:rPr>
+          <w:rStyle w:val="Strong"/>
+        </w:rPr>
+        <w:t>Failover</w:t>
+      </w:r>
+      <w:r>
+        <w:t>: In case of an instance failure, requests are redirected to other functional instances.</w:t>
+      </w:r>
+    </w:p>
+    <w:p>
+      <w:pPr>
+        <w:pStyle w:val="Heading4"/>
+      </w:pPr>
+      <w:r>
+        <w:t>Advantages:</w:t>
+      </w:r>
+    </w:p>
+    <w:p>
+      <w:pPr>
+        <w:numPr>
+          <w:ilvl w:val="0"/>
+          <w:numId w:val="45"/>
+        </w:numPr>
+        <w:spacing w:before="100" w:beforeAutospacing="1" w:after="100" w:afterAutospacing="1" w:line="240" w:lineRule="auto"/>
+      </w:pPr>
+      <w:r>
+        <w:rPr>
+          <w:rStyle w:val="Strong"/>
+        </w:rPr>
+        <w:t>Scalability</w:t>
+      </w:r>
+      <w:r>
+        <w:t>: Allows new instances to be added without impacting system availability.</w:t>
+      </w:r>
+    </w:p>
+    <w:p>
+      <w:pPr>
+        <w:numPr>
+          <w:ilvl w:val="0"/>
+          <w:numId w:val="45"/>
+        </w:numPr>
+        <w:spacing w:before="100" w:beforeAutospacing="1" w:after="100" w:afterAutospacing="1" w:line="240" w:lineRule="auto"/>
+      </w:pPr>
+      <w:r>
+        <w:rPr>
+          <w:rStyle w:val="Strong"/>
+        </w:rPr>
+        <w:t>Load Reduction</w:t>
+      </w:r>
+      <w:r>
+        <w:t>: Distributes requests evenly, preventing overloading.</w:t>
+      </w:r>
+    </w:p>
+    <w:p>
+      <w:pPr>
+        <w:numPr>
+          <w:ilvl w:val="0"/>
+          <w:numId w:val="45"/>
+        </w:numPr>
+        <w:spacing w:before="100" w:beforeAutospacing="1" w:after="100" w:afterAutospacing="1" w:line="240" w:lineRule="auto"/>
+      </w:pPr>
+      <w:r>
+        <w:rPr>
+          <w:rStyle w:val="Strong"/>
+        </w:rPr>
+        <w:t>Security</w:t>
+      </w:r>
+      <w:r>
+        <w:t>: The reverse proxy hides backend server details, adding an extra layer of protection.</w:t>
+      </w:r>
+    </w:p>
+    <w:p>
+      <w:pPr>
+        <w:spacing w:before="100" w:beforeAutospacing="1" w:after="100" w:afterAutospacing="1" w:line="240" w:lineRule="auto"/>
+        <w:ind w:left="720"/>
+        <w:rPr>
+          <w:rStyle w:val="Strong"/>
+        </w:rPr>
+      </w:pPr>
+    </w:p>
+    <w:p>
+      <w:pPr>
+        <w:spacing w:before="100" w:beforeAutospacing="1" w:after="100" w:afterAutospacing="1" w:line="240" w:lineRule="auto"/>
+        <w:ind w:left="720"/>
+      </w:pPr>
+    </w:p>
+    <w:p>
+      <w:pPr>
+        <w:pStyle w:val="NormalWeb"/>
+        <w:ind w:firstLine="360"/>
+      </w:pPr>
+      <w:r>
+        <w:t>The Reverse Proxy configuration for the project is as follows:</w:t>
+      </w:r>
+    </w:p>
+    <w:p>
+      <w:pPr>
+        <w:pStyle w:val="NormalWeb"/>
+      </w:pPr>
+    </w:p>
+    <w:p>
+      <w:pPr>
+        <w:pStyle w:val="NormalWeb"/>
+        <w:ind w:left="630"/>
+        <w:rPr>
+          <w:rFonts w:ascii="Cambria" w:hAnsi="Cambria"/>
+          <w:lang w:val="en-US"/>
+        </w:rPr>
+      </w:pPr>
+      <w:r>
+        <w:rPr>
+          <w:rFonts w:ascii="Cambria" w:hAnsi="Cambria"/>
+          <w:lang w:val="en-US"/>
+        </w:rPr>
+        <w:t>reverse-proxy:</w:t>
+      </w:r>
+      <w:r>
+        <w:rPr>
+          <w:rFonts w:ascii="Cambria" w:hAnsi="Cambria"/>
+          <w:lang w:val="en-US"/>
+        </w:rPr>
+        <w:br/>
+        <w:t xml:space="preserve">  image: traefik:v3.2</w:t>
+      </w:r>
+      <w:r>
+        <w:rPr>
+          <w:rFonts w:ascii="Cambria" w:hAnsi="Cambria"/>
+          <w:lang w:val="en-US"/>
+        </w:rPr>
+        <w:br/>
+        <w:t xml:space="preserve">  </w:t>
+      </w:r>
+      <w:proofErr w:type="spellStart"/>
+      <w:r>
+        <w:rPr>
+          <w:rFonts w:ascii="Cambria" w:hAnsi="Cambria"/>
+          <w:lang w:val="en-US"/>
+        </w:rPr>
+        <w:t>container_name</w:t>
+      </w:r>
+      <w:proofErr w:type="spellEnd"/>
+      <w:r>
+        <w:rPr>
+          <w:rFonts w:ascii="Cambria" w:hAnsi="Cambria"/>
+          <w:lang w:val="en-US"/>
+        </w:rPr>
+        <w:t xml:space="preserve">: </w:t>
+      </w:r>
+      <w:proofErr w:type="spellStart"/>
+      <w:r>
+        <w:rPr>
+          <w:rFonts w:ascii="Cambria" w:hAnsi="Cambria"/>
+          <w:lang w:val="en-US"/>
+        </w:rPr>
+        <w:t>traefik</w:t>
+      </w:r>
+      <w:proofErr w:type="spellEnd"/>
+      <w:r>
+        <w:rPr>
+          <w:rFonts w:ascii="Cambria" w:hAnsi="Cambria"/>
+          <w:lang w:val="en-US"/>
+        </w:rPr>
+        <w:br/>
+        <w:t xml:space="preserve">  command:</w:t>
+      </w:r>
+      <w:r>
+        <w:rPr>
+          <w:rFonts w:ascii="Cambria" w:hAnsi="Cambria"/>
+          <w:lang w:val="en-US"/>
+        </w:rPr>
+        <w:br/>
+        <w:t xml:space="preserve">    - --</w:t>
+      </w:r>
+      <w:proofErr w:type="spellStart"/>
+      <w:r>
+        <w:rPr>
+          <w:rFonts w:ascii="Cambria" w:hAnsi="Cambria"/>
+          <w:lang w:val="en-US"/>
+        </w:rPr>
+        <w:t>api.insecure</w:t>
+      </w:r>
+      <w:proofErr w:type="spellEnd"/>
+      <w:r>
+        <w:rPr>
+          <w:rFonts w:ascii="Cambria" w:hAnsi="Cambria"/>
+          <w:lang w:val="en-US"/>
+        </w:rPr>
+        <w:t>=true</w:t>
+      </w:r>
+      <w:r>
+        <w:rPr>
+          <w:rFonts w:ascii="Cambria" w:hAnsi="Cambria"/>
+          <w:lang w:val="en-US"/>
+        </w:rPr>
+        <w:br/>
+        <w:t xml:space="preserve">    - --</w:t>
+      </w:r>
+      <w:proofErr w:type="spellStart"/>
+      <w:r>
+        <w:rPr>
+          <w:rFonts w:ascii="Cambria" w:hAnsi="Cambria"/>
+          <w:lang w:val="en-US"/>
+        </w:rPr>
+        <w:t>providers.docker</w:t>
+      </w:r>
+      <w:proofErr w:type="spellEnd"/>
+      <w:r>
+        <w:rPr>
+          <w:rFonts w:ascii="Cambria" w:hAnsi="Cambria"/>
+          <w:lang w:val="en-US"/>
+        </w:rPr>
+        <w:br/>
+        <w:t xml:space="preserve">    - --</w:t>
+      </w:r>
+      <w:proofErr w:type="spellStart"/>
+      <w:r>
+        <w:rPr>
+          <w:rFonts w:ascii="Cambria" w:hAnsi="Cambria"/>
+          <w:lang w:val="en-US"/>
+        </w:rPr>
+        <w:t>accesslog</w:t>
+      </w:r>
+      <w:proofErr w:type="spellEnd"/>
+      <w:r>
+        <w:rPr>
+          <w:rFonts w:ascii="Cambria" w:hAnsi="Cambria"/>
+          <w:lang w:val="en-US"/>
+        </w:rPr>
+        <w:t>=true</w:t>
+      </w:r>
+      <w:r>
+        <w:rPr>
+          <w:rFonts w:ascii="Cambria" w:hAnsi="Cambria"/>
+          <w:lang w:val="en-US"/>
+        </w:rPr>
+        <w:br/>
+        <w:t xml:space="preserve">    - --</w:t>
+      </w:r>
+      <w:proofErr w:type="spellStart"/>
+      <w:r>
+        <w:rPr>
+          <w:rFonts w:ascii="Cambria" w:hAnsi="Cambria"/>
+          <w:lang w:val="en-US"/>
+        </w:rPr>
+        <w:t>accesslog.filepath</w:t>
+      </w:r>
+      <w:proofErr w:type="spellEnd"/>
+      <w:r>
+        <w:rPr>
+          <w:rFonts w:ascii="Cambria" w:hAnsi="Cambria"/>
+          <w:lang w:val="en-US"/>
+        </w:rPr>
+        <w:t>=/var/log/</w:t>
+      </w:r>
+      <w:proofErr w:type="spellStart"/>
+      <w:r>
+        <w:rPr>
+          <w:rFonts w:ascii="Cambria" w:hAnsi="Cambria"/>
+          <w:lang w:val="en-US"/>
+        </w:rPr>
+        <w:t>traefik</w:t>
+      </w:r>
+      <w:proofErr w:type="spellEnd"/>
+      <w:r>
+        <w:rPr>
+          <w:rFonts w:ascii="Cambria" w:hAnsi="Cambria"/>
+          <w:lang w:val="en-US"/>
+        </w:rPr>
+        <w:t>/access.log</w:t>
+      </w:r>
+      <w:r>
+        <w:rPr>
+          <w:rFonts w:ascii="Cambria" w:hAnsi="Cambria"/>
+          <w:lang w:val="en-US"/>
+        </w:rPr>
+        <w:br/>
+        <w:t xml:space="preserve">    - --</w:t>
+      </w:r>
+      <w:proofErr w:type="spellStart"/>
+      <w:r>
+        <w:rPr>
+          <w:rFonts w:ascii="Cambria" w:hAnsi="Cambria"/>
+          <w:lang w:val="en-US"/>
+        </w:rPr>
+        <w:t>log.level</w:t>
+      </w:r>
+      <w:proofErr w:type="spellEnd"/>
+      <w:r>
+        <w:rPr>
+          <w:rFonts w:ascii="Cambria" w:hAnsi="Cambria"/>
+          <w:lang w:val="en-US"/>
+        </w:rPr>
+        <w:t>=DEBUG</w:t>
+      </w:r>
+      <w:r>
+        <w:rPr>
+          <w:rFonts w:ascii="Cambria" w:hAnsi="Cambria"/>
+          <w:lang w:val="en-US"/>
+        </w:rPr>
+        <w:br/>
+        <w:t xml:space="preserve">    - --</w:t>
+      </w:r>
+      <w:proofErr w:type="spellStart"/>
+      <w:r>
+        <w:rPr>
+          <w:rFonts w:ascii="Cambria" w:hAnsi="Cambria"/>
+          <w:lang w:val="en-US"/>
+        </w:rPr>
+        <w:t>entryPoints.web.address</w:t>
+      </w:r>
+      <w:proofErr w:type="spellEnd"/>
+      <w:r>
+        <w:rPr>
+          <w:rFonts w:ascii="Cambria" w:hAnsi="Cambria"/>
+          <w:lang w:val="en-US"/>
+        </w:rPr>
+        <w:t>=:80</w:t>
+      </w:r>
+      <w:r>
+        <w:rPr>
+          <w:rFonts w:ascii="Cambria" w:hAnsi="Cambria"/>
+          <w:lang w:val="en-US"/>
+        </w:rPr>
+        <w:br/>
+        <w:t xml:space="preserve">  ports:</w:t>
+      </w:r>
+      <w:r>
+        <w:rPr>
+          <w:rFonts w:ascii="Cambria" w:hAnsi="Cambria"/>
+          <w:lang w:val="en-US"/>
+        </w:rPr>
+        <w:br/>
+        <w:t xml:space="preserve">    - "80:80"</w:t>
+      </w:r>
+      <w:r>
+        <w:rPr>
+          <w:rFonts w:ascii="Cambria" w:hAnsi="Cambria"/>
+          <w:lang w:val="en-US"/>
+        </w:rPr>
+        <w:br/>
+        <w:t xml:space="preserve">    - "8080:8080"</w:t>
+      </w:r>
+      <w:r>
+        <w:rPr>
+          <w:rFonts w:ascii="Cambria" w:hAnsi="Cambria"/>
+          <w:lang w:val="en-US"/>
+        </w:rPr>
+        <w:br/>
+        <w:t xml:space="preserve">  volumes:</w:t>
+      </w:r>
+      <w:r>
+        <w:rPr>
+          <w:rFonts w:ascii="Cambria" w:hAnsi="Cambria"/>
+          <w:lang w:val="en-US"/>
+        </w:rPr>
+        <w:br/>
+        <w:t xml:space="preserve">    - /var/run/</w:t>
+      </w:r>
+      <w:proofErr w:type="spellStart"/>
+      <w:r>
+        <w:rPr>
+          <w:rFonts w:ascii="Cambria" w:hAnsi="Cambria"/>
+          <w:lang w:val="en-US"/>
+        </w:rPr>
+        <w:t>docker.sock</w:t>
+      </w:r>
+      <w:proofErr w:type="spellEnd"/>
+      <w:r>
+        <w:rPr>
+          <w:rFonts w:ascii="Cambria" w:hAnsi="Cambria"/>
+          <w:lang w:val="en-US"/>
+        </w:rPr>
+        <w:t>:/var/run/</w:t>
+      </w:r>
+      <w:proofErr w:type="spellStart"/>
+      <w:r>
+        <w:rPr>
+          <w:rFonts w:ascii="Cambria" w:hAnsi="Cambria"/>
+          <w:lang w:val="en-US"/>
+        </w:rPr>
+        <w:t>docker.sock</w:t>
+      </w:r>
+      <w:proofErr w:type="spellEnd"/>
+      <w:r>
+        <w:rPr>
+          <w:rFonts w:ascii="Cambria" w:hAnsi="Cambria"/>
+          <w:lang w:val="en-US"/>
+        </w:rPr>
+        <w:t xml:space="preserve"> #.ro</w:t>
+      </w:r>
+      <w:r>
+        <w:rPr>
+          <w:rFonts w:ascii="Cambria" w:hAnsi="Cambria"/>
+          <w:lang w:val="en-US"/>
+        </w:rPr>
+        <w:br/>
+        <w:t xml:space="preserve">    - </w:t>
+      </w:r>
+      <w:proofErr w:type="spellStart"/>
+      <w:r>
+        <w:rPr>
+          <w:rFonts w:ascii="Cambria" w:hAnsi="Cambria"/>
+          <w:lang w:val="en-US"/>
+        </w:rPr>
+        <w:t>traefik_logs</w:t>
+      </w:r>
+      <w:proofErr w:type="spellEnd"/>
+      <w:r>
+        <w:rPr>
+          <w:rFonts w:ascii="Cambria" w:hAnsi="Cambria"/>
+          <w:lang w:val="en-US"/>
+        </w:rPr>
+        <w:t>:/var/log/</w:t>
+      </w:r>
+      <w:proofErr w:type="spellStart"/>
+      <w:r>
+        <w:rPr>
+          <w:rFonts w:ascii="Cambria" w:hAnsi="Cambria"/>
+          <w:lang w:val="en-US"/>
+        </w:rPr>
+        <w:t>traefik</w:t>
+      </w:r>
+      <w:proofErr w:type="spellEnd"/>
+      <w:r>
+        <w:rPr>
+          <w:rFonts w:ascii="Cambria" w:hAnsi="Cambria"/>
+          <w:lang w:val="en-US"/>
+        </w:rPr>
+        <w:br/>
+        <w:t xml:space="preserve">  networks:</w:t>
+      </w:r>
+      <w:r>
+        <w:rPr>
+          <w:rFonts w:ascii="Cambria" w:hAnsi="Cambria"/>
+          <w:lang w:val="en-US"/>
+        </w:rPr>
+        <w:br/>
+        <w:t xml:space="preserve">    </w:t>
+      </w:r>
+      <w:proofErr w:type="spellStart"/>
+      <w:r>
+        <w:rPr>
+          <w:rFonts w:ascii="Cambria" w:hAnsi="Cambria"/>
+          <w:lang w:val="en-US"/>
+        </w:rPr>
+        <w:t>demo_net</w:t>
+      </w:r>
+      <w:proofErr w:type="spellEnd"/>
+      <w:r>
+        <w:rPr>
+          <w:rFonts w:ascii="Cambria" w:hAnsi="Cambria"/>
+          <w:lang w:val="en-US"/>
+        </w:rPr>
+        <w:t>:</w:t>
+      </w:r>
+    </w:p>
+    <w:p>
+      <w:pPr>
+        <w:pStyle w:val="NormalWeb"/>
+      </w:pPr>
+    </w:p>
+    <w:p>
+      <w:pPr>
+        <w:pStyle w:val="ListParagraph"/>
+        <w:numPr>
+          <w:ilvl w:val="0"/>
+          <w:numId w:val="1"/>
+        </w:numPr>
+        <w:rPr>
+          <w:b/>
+          <w:bCs/>
+          <w:sz w:val="32"/>
+          <w:szCs w:val="32"/>
+        </w:rPr>
+      </w:pPr>
+      <w:r>
+        <w:rPr>
+          <w:b/>
+          <w:bCs/>
+          <w:sz w:val="32"/>
+          <w:szCs w:val="32"/>
+        </w:rPr>
+        <w:t>Project Overview</w:t>
+      </w:r>
+    </w:p>
+    <w:p>
+      <w:pPr>
+        <w:pStyle w:val="ListParagraph"/>
+        <w:ind w:left="630"/>
+        <w:rPr>
+          <w:b/>
+          <w:bCs/>
+          <w:sz w:val="32"/>
+          <w:szCs w:val="32"/>
+        </w:rPr>
+      </w:pPr>
+    </w:p>
+    <w:p>
+      <w:pPr>
+        <w:pStyle w:val="ListParagraph"/>
+        <w:ind w:left="630"/>
+        <w:rPr>
+          <w:b/>
+          <w:bCs/>
+          <w:sz w:val="32"/>
+          <w:szCs w:val="32"/>
+        </w:rPr>
+      </w:pPr>
+      <w:r>
+        <w:rPr>
+          <w:b/>
+          <w:bCs/>
+          <w:sz w:val="32"/>
+          <w:szCs w:val="32"/>
+        </w:rPr>
+        <w:drawing>
+          <wp:inline distT="0" distB="0" distL="0" distR="0" wp14:anchorId="3B60FFC9" wp14:editId="71B6ADAE">
+            <wp:extent cx="6225540" cy="3505325"/>
+            <wp:effectExtent l="0" t="0" r="0" b="0"/>
+            <wp:docPr id="241561848" name="Picture 1" descr="A diagram of a software&#10;&#10;Description automatically generated"/>
+            <wp:cNvGraphicFramePr>
+              <a:graphicFrameLocks xmlns:a="http://schemas.openxmlformats.org/drawingml/2006/main" noChangeAspect="1"/>
+            </wp:cNvGraphicFramePr>
+            <a:graphic xmlns:a="http://schemas.openxmlformats.org/drawingml/2006/main">
+              <a:graphicData uri="http://schemas.openxmlformats.org/drawingml/2006/picture">
+                <pic:pic xmlns:pic="http://schemas.openxmlformats.org/drawingml/2006/picture">
+                  <pic:nvPicPr>
+                    <pic:cNvPr id="241561848" name="Picture 1" descr="A diagram of a software&#10;&#10;Description automatically generated"/>
+                    <pic:cNvPicPr/>
+                  </pic:nvPicPr>
+                  <pic:blipFill>
+                    <a:blip r:embed="rId14"/>
+                    <a:stretch>
+                      <a:fillRect/>
+                    </a:stretch>
+                  </pic:blipFill>
+                  <pic:spPr>
+                    <a:xfrm>
+                      <a:off x="0" y="0"/>
+                      <a:ext cx="6237289" cy="3511940"/>
+                    </a:xfrm>
+                    <a:prstGeom prst="rect">
+                      <a:avLst/>
+                    </a:prstGeom>
+                  </pic:spPr>
+                </pic:pic>
+              </a:graphicData>
+            </a:graphic>
+          </wp:inline>
+        </w:drawing>
+      </w:r>
+    </w:p>
+    <w:p>
+      <w:pPr>
+        <w:pStyle w:val="ListParagraph"/>
+        <w:ind w:left="630"/>
+        <w:rPr>
+          <w:b/>
+          <w:bCs/>
+          <w:sz w:val="32"/>
+          <w:szCs w:val="32"/>
+        </w:rPr>
+      </w:pPr>
+    </w:p>
+    <w:p>
+      <w:pPr>
+        <w:pStyle w:val="ListParagraph"/>
+        <w:ind w:left="630"/>
+        <w:rPr>
+          <w:b/>
+          <w:bCs/>
+          <w:sz w:val="32"/>
+          <w:szCs w:val="32"/>
+        </w:rPr>
+      </w:pPr>
+      <w:r>
+        <w:rPr>
+          <w:b/>
+          <w:bCs/>
+          <w:noProof/>
+          <w:sz w:val="32"/>
+          <w:szCs w:val="32"/>
+        </w:rPr>
+        <w:drawing>
+          <wp:inline distT="0" distB="0" distL="0" distR="0" wp14:anchorId="4E88F7AF" wp14:editId="2CD143AA">
+            <wp:extent cx="6393180" cy="3154680"/>
+            <wp:effectExtent l="0" t="0" r="0" b="0"/>
+            <wp:docPr id="648333522" name="Picture 1"/>
+            <wp:cNvGraphicFramePr>
+              <a:graphicFrameLocks xmlns:a="http://schemas.openxmlformats.org/drawingml/2006/main" noChangeAspect="1"/>
+            </wp:cNvGraphicFramePr>
+            <a:graphic xmlns:a="http://schemas.openxmlformats.org/drawingml/2006/main">
+              <a:graphicData uri="http://schemas.openxmlformats.org/drawingml/2006/picture">
+                <pic:pic xmlns:pic="http://schemas.openxmlformats.org/drawingml/2006/picture">
+                  <pic:nvPicPr>
+                    <pic:cNvPr id="0" name="Picture 1"/>
+                    <pic:cNvPicPr>
+                      <a:picLocks noChangeAspect="1" noChangeArrowheads="1"/>
+                    </pic:cNvPicPr>
+                  </pic:nvPicPr>
+                  <pic:blipFill>
+                    <a:blip r:embed="rId15">
+                      <a:extLst>
+                        <a:ext uri="{28A0092B-C50C-407E-A947-70E740481C1C}">
+                          <a14:useLocalDpi xmlns:a14="http://schemas.microsoft.com/office/drawing/2010/main" val="0"/>
+                        </a:ext>
+                      </a:extLst>
+                    </a:blip>
+                    <a:srcRect/>
+                    <a:stretch>
+                      <a:fillRect/>
+                    </a:stretch>
+                  </pic:blipFill>
+                  <pic:spPr bwMode="auto">
+                    <a:xfrm>
+                      <a:off x="0" y="0"/>
+                      <a:ext cx="6393180" cy="3154680"/>
+                    </a:xfrm>
+                    <a:prstGeom prst="rect">
+                      <a:avLst/>
+                    </a:prstGeom>
+                    <a:noFill/>
+                    <a:ln>
+                      <a:noFill/>
+                    </a:ln>
+                  </pic:spPr>
+                </pic:pic>
+              </a:graphicData>
+            </a:graphic>
+          </wp:inline>
+        </w:drawing>
+      </w:r>
     </w:p>
     <w:p>
       <w:pPr>
@@ -5695,15 +7986,11 @@
           <w:numId w:val="1"/>
         </w:numPr>
       </w:pPr>
-      <w:r>
-        <w:t>References</w:t>
-      </w:r>
-      <w:r>
-        <w:t xml:space="preserve"> </w:t>
-      </w:r>
-      <w:r>
-        <w:t>:</w:t>
-      </w:r>
+      <w:proofErr w:type="gramStart"/>
+      <w:r>
+        <w:t>References :</w:t>
+      </w:r>
+      <w:proofErr w:type="gramEnd"/>
     </w:p>
     <w:p/>
     <w:p>
@@ -5714,20 +8001,13 @@
           <w:numId w:val="29"/>
         </w:numPr>
       </w:pPr>
-      <w:hyperlink r:id="rId14" w:history="1">
+      <w:hyperlink r:id="rId16" w:history="1">
         <w:r>
           <w:rPr>
             <w:rStyle w:val="Hyperlink"/>
             <w:sz w:val="22"/>
           </w:rPr>
-          <w:t>https://en.wikipedia.org/wiki/Microservice</w:t>
-        </w:r>
-        <w:r>
-          <w:rPr>
-            <w:rStyle w:val="Hyperlink"/>
-            <w:sz w:val="22"/>
-          </w:rPr>
-          <w:t>s</w:t>
+          <w:t>https://en.wikipedia.org/wiki/Microservices</w:t>
         </w:r>
       </w:hyperlink>
     </w:p>
@@ -5739,7 +8019,7 @@
           <w:numId w:val="29"/>
         </w:numPr>
       </w:pPr>
-      <w:hyperlink r:id="rId15" w:history="1">
+      <w:hyperlink r:id="rId17" w:history="1">
         <w:r>
           <w:rPr>
             <w:rStyle w:val="Hyperlink"/>
@@ -5757,7 +8037,7 @@
           <w:numId w:val="29"/>
         </w:numPr>
       </w:pPr>
-      <w:hyperlink r:id="rId16" w:history="1">
+      <w:hyperlink r:id="rId18" w:history="1">
         <w:r>
           <w:rPr>
             <w:rStyle w:val="Hyperlink"/>
@@ -5775,7 +8055,7 @@
           <w:numId w:val="29"/>
         </w:numPr>
       </w:pPr>
-      <w:hyperlink r:id="rId17" w:history="1">
+      <w:hyperlink r:id="rId19" w:history="1">
         <w:r>
           <w:rPr>
             <w:rStyle w:val="Hyperlink"/>
@@ -5793,7 +8073,7 @@
           <w:numId w:val="29"/>
         </w:numPr>
       </w:pPr>
-      <w:hyperlink r:id="rId18" w:history="1">
+      <w:hyperlink r:id="rId20" w:history="1">
         <w:r>
           <w:rPr>
             <w:rStyle w:val="Hyperlink"/>
@@ -5814,7 +8094,7 @@
           <w:sz w:val="22"/>
         </w:rPr>
       </w:pPr>
-      <w:hyperlink r:id="rId19" w:history="1">
+      <w:hyperlink r:id="rId21" w:history="1">
         <w:r>
           <w:rPr>
             <w:rStyle w:val="Hyperlink"/>
@@ -5835,7 +8115,7 @@
           <w:sz w:val="22"/>
         </w:rPr>
       </w:pPr>
-      <w:hyperlink r:id="rId20" w:history="1">
+      <w:hyperlink r:id="rId22" w:history="1">
         <w:r>
           <w:rPr>
             <w:rStyle w:val="Hyperlink"/>
@@ -5856,7 +8136,7 @@
           <w:sz w:val="22"/>
         </w:rPr>
       </w:pPr>
-      <w:hyperlink r:id="rId21" w:history="1">
+      <w:hyperlink r:id="rId23" w:history="1">
         <w:r>
           <w:rPr>
             <w:rStyle w:val="Hyperlink"/>
@@ -5877,7 +8157,7 @@
           <w:sz w:val="22"/>
         </w:rPr>
       </w:pPr>
-      <w:hyperlink r:id="rId22" w:history="1">
+      <w:hyperlink r:id="rId24" w:history="1">
         <w:r>
           <w:rPr>
             <w:rStyle w:val="Hyperlink"/>
@@ -5898,7 +8178,7 @@
           <w:sz w:val="22"/>
         </w:rPr>
       </w:pPr>
-      <w:hyperlink r:id="rId23" w:history="1">
+      <w:hyperlink r:id="rId25" w:history="1">
         <w:r>
           <w:rPr>
             <w:rStyle w:val="Hyperlink"/>
@@ -5919,7 +8199,7 @@
           <w:sz w:val="22"/>
         </w:rPr>
       </w:pPr>
-      <w:hyperlink r:id="rId24" w:history="1">
+      <w:hyperlink r:id="rId26" w:history="1">
         <w:r>
           <w:rPr>
             <w:rStyle w:val="Hyperlink"/>
@@ -5940,7 +8220,7 @@
           <w:sz w:val="22"/>
         </w:rPr>
       </w:pPr>
-      <w:hyperlink r:id="rId25" w:history="1">
+      <w:hyperlink r:id="rId27" w:history="1">
         <w:r>
           <w:rPr>
             <w:rStyle w:val="Hyperlink"/>
@@ -5961,7 +8241,7 @@
           <w:sz w:val="22"/>
         </w:rPr>
       </w:pPr>
-      <w:hyperlink r:id="rId26" w:history="1">
+      <w:hyperlink r:id="rId28" w:history="1">
         <w:r>
           <w:rPr>
             <w:rStyle w:val="Hyperlink"/>
@@ -5973,7 +8253,7 @@
     </w:p>
     <w:p/>
     <w:sectPr>
-      <w:footerReference w:type="default" r:id="rId27"/>
+      <w:footerReference w:type="default" r:id="rId29"/>
       <w:pgSz w:w="12240" w:h="15840"/>
       <w:pgMar w:top="720" w:right="720" w:bottom="720" w:left="720" w:header="720" w:footer="720" w:gutter="0"/>
       <w:cols w:space="720"/>
@@ -6379,6 +8659,155 @@
     </w:lvl>
   </w:abstractNum>
   <w:abstractNum w:abstractNumId="2" w15:restartNumberingAfterBreak="0">
+    <w:nsid w:val="06CB4E7B"/>
+    <w:multiLevelType w:val="multilevel"/>
+    <w:tmpl w:val="F3BE8752"/>
+    <w:lvl w:ilvl="0">
+      <w:start w:val="1"/>
+      <w:numFmt w:val="bullet"/>
+      <w:lvlText w:val=""/>
+      <w:lvlJc w:val="left"/>
+      <w:pPr>
+        <w:tabs>
+          <w:tab w:val="num" w:pos="720"/>
+        </w:tabs>
+        <w:ind w:left="720" w:hanging="360"/>
+      </w:pPr>
+      <w:rPr>
+        <w:rFonts w:ascii="Symbol" w:hAnsi="Symbol" w:hint="default"/>
+        <w:sz w:val="20"/>
+      </w:rPr>
+    </w:lvl>
+    <w:lvl w:ilvl="1">
+      <w:start w:val="1"/>
+      <w:numFmt w:val="bullet"/>
+      <w:lvlText w:val="o"/>
+      <w:lvlJc w:val="left"/>
+      <w:pPr>
+        <w:tabs>
+          <w:tab w:val="num" w:pos="1440"/>
+        </w:tabs>
+        <w:ind w:left="1440" w:hanging="360"/>
+      </w:pPr>
+      <w:rPr>
+        <w:rFonts w:ascii="Courier New" w:hAnsi="Courier New" w:hint="default"/>
+        <w:sz w:val="20"/>
+      </w:rPr>
+    </w:lvl>
+    <w:lvl w:ilvl="2" w:tentative="1">
+      <w:start w:val="1"/>
+      <w:numFmt w:val="bullet"/>
+      <w:lvlText w:val=""/>
+      <w:lvlJc w:val="left"/>
+      <w:pPr>
+        <w:tabs>
+          <w:tab w:val="num" w:pos="2160"/>
+        </w:tabs>
+        <w:ind w:left="2160" w:hanging="360"/>
+      </w:pPr>
+      <w:rPr>
+        <w:rFonts w:ascii="Wingdings" w:hAnsi="Wingdings" w:hint="default"/>
+        <w:sz w:val="20"/>
+      </w:rPr>
+    </w:lvl>
+    <w:lvl w:ilvl="3" w:tentative="1">
+      <w:start w:val="1"/>
+      <w:numFmt w:val="bullet"/>
+      <w:lvlText w:val=""/>
+      <w:lvlJc w:val="left"/>
+      <w:pPr>
+        <w:tabs>
+          <w:tab w:val="num" w:pos="2880"/>
+        </w:tabs>
+        <w:ind w:left="2880" w:hanging="360"/>
+      </w:pPr>
+      <w:rPr>
+        <w:rFonts w:ascii="Wingdings" w:hAnsi="Wingdings" w:hint="default"/>
+        <w:sz w:val="20"/>
+      </w:rPr>
+    </w:lvl>
+    <w:lvl w:ilvl="4" w:tentative="1">
+      <w:start w:val="1"/>
+      <w:numFmt w:val="bullet"/>
+      <w:lvlText w:val=""/>
+      <w:lvlJc w:val="left"/>
+      <w:pPr>
+        <w:tabs>
+          <w:tab w:val="num" w:pos="3600"/>
+        </w:tabs>
+        <w:ind w:left="3600" w:hanging="360"/>
+      </w:pPr>
+      <w:rPr>
+        <w:rFonts w:ascii="Wingdings" w:hAnsi="Wingdings" w:hint="default"/>
+        <w:sz w:val="20"/>
+      </w:rPr>
+    </w:lvl>
+    <w:lvl w:ilvl="5" w:tentative="1">
+      <w:start w:val="1"/>
+      <w:numFmt w:val="bullet"/>
+      <w:lvlText w:val=""/>
+      <w:lvlJc w:val="left"/>
+      <w:pPr>
+        <w:tabs>
+          <w:tab w:val="num" w:pos="4320"/>
+        </w:tabs>
+        <w:ind w:left="4320" w:hanging="360"/>
+      </w:pPr>
+      <w:rPr>
+        <w:rFonts w:ascii="Wingdings" w:hAnsi="Wingdings" w:hint="default"/>
+        <w:sz w:val="20"/>
+      </w:rPr>
+    </w:lvl>
+    <w:lvl w:ilvl="6" w:tentative="1">
+      <w:start w:val="1"/>
+      <w:numFmt w:val="bullet"/>
+      <w:lvlText w:val=""/>
+      <w:lvlJc w:val="left"/>
+      <w:pPr>
+        <w:tabs>
+          <w:tab w:val="num" w:pos="5040"/>
+        </w:tabs>
+        <w:ind w:left="5040" w:hanging="360"/>
+      </w:pPr>
+      <w:rPr>
+        <w:rFonts w:ascii="Wingdings" w:hAnsi="Wingdings" w:hint="default"/>
+        <w:sz w:val="20"/>
+      </w:rPr>
+    </w:lvl>
+    <w:lvl w:ilvl="7" w:tentative="1">
+      <w:start w:val="1"/>
+      <w:numFmt w:val="bullet"/>
+      <w:lvlText w:val=""/>
+      <w:lvlJc w:val="left"/>
+      <w:pPr>
+        <w:tabs>
+          <w:tab w:val="num" w:pos="5760"/>
+        </w:tabs>
+        <w:ind w:left="5760" w:hanging="360"/>
+      </w:pPr>
+      <w:rPr>
+        <w:rFonts w:ascii="Wingdings" w:hAnsi="Wingdings" w:hint="default"/>
+        <w:sz w:val="20"/>
+      </w:rPr>
+    </w:lvl>
+    <w:lvl w:ilvl="8" w:tentative="1">
+      <w:start w:val="1"/>
+      <w:numFmt w:val="bullet"/>
+      <w:lvlText w:val=""/>
+      <w:lvlJc w:val="left"/>
+      <w:pPr>
+        <w:tabs>
+          <w:tab w:val="num" w:pos="6480"/>
+        </w:tabs>
+        <w:ind w:left="6480" w:hanging="360"/>
+      </w:pPr>
+      <w:rPr>
+        <w:rFonts w:ascii="Wingdings" w:hAnsi="Wingdings" w:hint="default"/>
+        <w:sz w:val="20"/>
+      </w:rPr>
+    </w:lvl>
+  </w:abstractNum>
+  <w:abstractNum w:abstractNumId="3" w15:restartNumberingAfterBreak="0">
     <w:nsid w:val="0BF5720E"/>
     <w:multiLevelType w:val="multilevel"/>
     <w:tmpl w:val="C638C5E8"/>
@@ -6527,7 +8956,7 @@
       </w:rPr>
     </w:lvl>
   </w:abstractNum>
-  <w:abstractNum w:abstractNumId="3" w15:restartNumberingAfterBreak="0">
+  <w:abstractNum w:abstractNumId="4" w15:restartNumberingAfterBreak="0">
     <w:nsid w:val="10F25145"/>
     <w:multiLevelType w:val="multilevel"/>
     <w:tmpl w:val="2D009CEC"/>
@@ -6676,7 +9105,7 @@
       </w:rPr>
     </w:lvl>
   </w:abstractNum>
-  <w:abstractNum w:abstractNumId="4" w15:restartNumberingAfterBreak="0">
+  <w:abstractNum w:abstractNumId="5" w15:restartNumberingAfterBreak="0">
     <w:nsid w:val="17B77BB0"/>
     <w:multiLevelType w:val="multilevel"/>
     <w:tmpl w:val="1F00CB18"/>
@@ -6773,7 +9202,7 @@
       </w:pPr>
     </w:lvl>
   </w:abstractNum>
-  <w:abstractNum w:abstractNumId="5" w15:restartNumberingAfterBreak="0">
+  <w:abstractNum w:abstractNumId="6" w15:restartNumberingAfterBreak="0">
     <w:nsid w:val="17DF68E1"/>
     <w:multiLevelType w:val="multilevel"/>
     <w:tmpl w:val="B7E082EC"/>
@@ -6922,7 +9351,7 @@
       </w:rPr>
     </w:lvl>
   </w:abstractNum>
-  <w:abstractNum w:abstractNumId="6" w15:restartNumberingAfterBreak="0">
+  <w:abstractNum w:abstractNumId="7" w15:restartNumberingAfterBreak="0">
     <w:nsid w:val="1C674A22"/>
     <w:multiLevelType w:val="multilevel"/>
     <w:tmpl w:val="A2DC7B3A"/>
@@ -7071,7 +9500,156 @@
       </w:rPr>
     </w:lvl>
   </w:abstractNum>
-  <w:abstractNum w:abstractNumId="7" w15:restartNumberingAfterBreak="0">
+  <w:abstractNum w:abstractNumId="8" w15:restartNumberingAfterBreak="0">
+    <w:nsid w:val="1FDF626B"/>
+    <w:multiLevelType w:val="multilevel"/>
+    <w:tmpl w:val="B7BEA350"/>
+    <w:lvl w:ilvl="0">
+      <w:start w:val="1"/>
+      <w:numFmt w:val="bullet"/>
+      <w:lvlText w:val=""/>
+      <w:lvlJc w:val="left"/>
+      <w:pPr>
+        <w:tabs>
+          <w:tab w:val="num" w:pos="720"/>
+        </w:tabs>
+        <w:ind w:left="720" w:hanging="360"/>
+      </w:pPr>
+      <w:rPr>
+        <w:rFonts w:ascii="Symbol" w:hAnsi="Symbol" w:hint="default"/>
+        <w:sz w:val="20"/>
+      </w:rPr>
+    </w:lvl>
+    <w:lvl w:ilvl="1" w:tentative="1">
+      <w:start w:val="1"/>
+      <w:numFmt w:val="bullet"/>
+      <w:lvlText w:val="o"/>
+      <w:lvlJc w:val="left"/>
+      <w:pPr>
+        <w:tabs>
+          <w:tab w:val="num" w:pos="1440"/>
+        </w:tabs>
+        <w:ind w:left="1440" w:hanging="360"/>
+      </w:pPr>
+      <w:rPr>
+        <w:rFonts w:ascii="Courier New" w:hAnsi="Courier New" w:hint="default"/>
+        <w:sz w:val="20"/>
+      </w:rPr>
+    </w:lvl>
+    <w:lvl w:ilvl="2" w:tentative="1">
+      <w:start w:val="1"/>
+      <w:numFmt w:val="bullet"/>
+      <w:lvlText w:val=""/>
+      <w:lvlJc w:val="left"/>
+      <w:pPr>
+        <w:tabs>
+          <w:tab w:val="num" w:pos="2160"/>
+        </w:tabs>
+        <w:ind w:left="2160" w:hanging="360"/>
+      </w:pPr>
+      <w:rPr>
+        <w:rFonts w:ascii="Wingdings" w:hAnsi="Wingdings" w:hint="default"/>
+        <w:sz w:val="20"/>
+      </w:rPr>
+    </w:lvl>
+    <w:lvl w:ilvl="3" w:tentative="1">
+      <w:start w:val="1"/>
+      <w:numFmt w:val="bullet"/>
+      <w:lvlText w:val=""/>
+      <w:lvlJc w:val="left"/>
+      <w:pPr>
+        <w:tabs>
+          <w:tab w:val="num" w:pos="2880"/>
+        </w:tabs>
+        <w:ind w:left="2880" w:hanging="360"/>
+      </w:pPr>
+      <w:rPr>
+        <w:rFonts w:ascii="Wingdings" w:hAnsi="Wingdings" w:hint="default"/>
+        <w:sz w:val="20"/>
+      </w:rPr>
+    </w:lvl>
+    <w:lvl w:ilvl="4" w:tentative="1">
+      <w:start w:val="1"/>
+      <w:numFmt w:val="bullet"/>
+      <w:lvlText w:val=""/>
+      <w:lvlJc w:val="left"/>
+      <w:pPr>
+        <w:tabs>
+          <w:tab w:val="num" w:pos="3600"/>
+        </w:tabs>
+        <w:ind w:left="3600" w:hanging="360"/>
+      </w:pPr>
+      <w:rPr>
+        <w:rFonts w:ascii="Wingdings" w:hAnsi="Wingdings" w:hint="default"/>
+        <w:sz w:val="20"/>
+      </w:rPr>
+    </w:lvl>
+    <w:lvl w:ilvl="5" w:tentative="1">
+      <w:start w:val="1"/>
+      <w:numFmt w:val="bullet"/>
+      <w:lvlText w:val=""/>
+      <w:lvlJc w:val="left"/>
+      <w:pPr>
+        <w:tabs>
+          <w:tab w:val="num" w:pos="4320"/>
+        </w:tabs>
+        <w:ind w:left="4320" w:hanging="360"/>
+      </w:pPr>
+      <w:rPr>
+        <w:rFonts w:ascii="Wingdings" w:hAnsi="Wingdings" w:hint="default"/>
+        <w:sz w:val="20"/>
+      </w:rPr>
+    </w:lvl>
+    <w:lvl w:ilvl="6" w:tentative="1">
+      <w:start w:val="1"/>
+      <w:numFmt w:val="bullet"/>
+      <w:lvlText w:val=""/>
+      <w:lvlJc w:val="left"/>
+      <w:pPr>
+        <w:tabs>
+          <w:tab w:val="num" w:pos="5040"/>
+        </w:tabs>
+        <w:ind w:left="5040" w:hanging="360"/>
+      </w:pPr>
+      <w:rPr>
+        <w:rFonts w:ascii="Wingdings" w:hAnsi="Wingdings" w:hint="default"/>
+        <w:sz w:val="20"/>
+      </w:rPr>
+    </w:lvl>
+    <w:lvl w:ilvl="7" w:tentative="1">
+      <w:start w:val="1"/>
+      <w:numFmt w:val="bullet"/>
+      <w:lvlText w:val=""/>
+      <w:lvlJc w:val="left"/>
+      <w:pPr>
+        <w:tabs>
+          <w:tab w:val="num" w:pos="5760"/>
+        </w:tabs>
+        <w:ind w:left="5760" w:hanging="360"/>
+      </w:pPr>
+      <w:rPr>
+        <w:rFonts w:ascii="Wingdings" w:hAnsi="Wingdings" w:hint="default"/>
+        <w:sz w:val="20"/>
+      </w:rPr>
+    </w:lvl>
+    <w:lvl w:ilvl="8" w:tentative="1">
+      <w:start w:val="1"/>
+      <w:numFmt w:val="bullet"/>
+      <w:lvlText w:val=""/>
+      <w:lvlJc w:val="left"/>
+      <w:pPr>
+        <w:tabs>
+          <w:tab w:val="num" w:pos="6480"/>
+        </w:tabs>
+        <w:ind w:left="6480" w:hanging="360"/>
+      </w:pPr>
+      <w:rPr>
+        <w:rFonts w:ascii="Wingdings" w:hAnsi="Wingdings" w:hint="default"/>
+        <w:sz w:val="20"/>
+      </w:rPr>
+    </w:lvl>
+  </w:abstractNum>
+  <w:abstractNum w:abstractNumId="9" w15:restartNumberingAfterBreak="0">
     <w:nsid w:val="261A645E"/>
     <w:multiLevelType w:val="multilevel"/>
     <w:tmpl w:val="6E0AFA40"/>
@@ -7220,7 +9798,7 @@
       </w:rPr>
     </w:lvl>
   </w:abstractNum>
-  <w:abstractNum w:abstractNumId="8" w15:restartNumberingAfterBreak="0">
+  <w:abstractNum w:abstractNumId="10" w15:restartNumberingAfterBreak="0">
     <w:nsid w:val="26A254F9"/>
     <w:multiLevelType w:val="multilevel"/>
     <w:tmpl w:val="3222A274"/>
@@ -7369,7 +9947,269 @@
       </w:rPr>
     </w:lvl>
   </w:abstractNum>
-  <w:abstractNum w:abstractNumId="9" w15:restartNumberingAfterBreak="0">
+  <w:abstractNum w:abstractNumId="11" w15:restartNumberingAfterBreak="0">
+    <w:nsid w:val="27884585"/>
+    <w:multiLevelType w:val="multilevel"/>
+    <w:tmpl w:val="73B45180"/>
+    <w:lvl w:ilvl="0">
+      <w:start w:val="1"/>
+      <w:numFmt w:val="decimal"/>
+      <w:lvlText w:val="%1."/>
+      <w:lvlJc w:val="left"/>
+      <w:pPr>
+        <w:tabs>
+          <w:tab w:val="num" w:pos="720"/>
+        </w:tabs>
+        <w:ind w:left="720" w:hanging="360"/>
+      </w:pPr>
+    </w:lvl>
+    <w:lvl w:ilvl="1" w:tentative="1">
+      <w:start w:val="1"/>
+      <w:numFmt w:val="decimal"/>
+      <w:lvlText w:val="%2."/>
+      <w:lvlJc w:val="left"/>
+      <w:pPr>
+        <w:tabs>
+          <w:tab w:val="num" w:pos="1440"/>
+        </w:tabs>
+        <w:ind w:left="1440" w:hanging="360"/>
+      </w:pPr>
+    </w:lvl>
+    <w:lvl w:ilvl="2" w:tentative="1">
+      <w:start w:val="1"/>
+      <w:numFmt w:val="decimal"/>
+      <w:lvlText w:val="%3."/>
+      <w:lvlJc w:val="left"/>
+      <w:pPr>
+        <w:tabs>
+          <w:tab w:val="num" w:pos="2160"/>
+        </w:tabs>
+        <w:ind w:left="2160" w:hanging="360"/>
+      </w:pPr>
+    </w:lvl>
+    <w:lvl w:ilvl="3" w:tentative="1">
+      <w:start w:val="1"/>
+      <w:numFmt w:val="decimal"/>
+      <w:lvlText w:val="%4."/>
+      <w:lvlJc w:val="left"/>
+      <w:pPr>
+        <w:tabs>
+          <w:tab w:val="num" w:pos="2880"/>
+        </w:tabs>
+        <w:ind w:left="2880" w:hanging="360"/>
+      </w:pPr>
+    </w:lvl>
+    <w:lvl w:ilvl="4" w:tentative="1">
+      <w:start w:val="1"/>
+      <w:numFmt w:val="decimal"/>
+      <w:lvlText w:val="%5."/>
+      <w:lvlJc w:val="left"/>
+      <w:pPr>
+        <w:tabs>
+          <w:tab w:val="num" w:pos="3600"/>
+        </w:tabs>
+        <w:ind w:left="3600" w:hanging="360"/>
+      </w:pPr>
+    </w:lvl>
+    <w:lvl w:ilvl="5" w:tentative="1">
+      <w:start w:val="1"/>
+      <w:numFmt w:val="decimal"/>
+      <w:lvlText w:val="%6."/>
+      <w:lvlJc w:val="left"/>
+      <w:pPr>
+        <w:tabs>
+          <w:tab w:val="num" w:pos="4320"/>
+        </w:tabs>
+        <w:ind w:left="4320" w:hanging="360"/>
+      </w:pPr>
+    </w:lvl>
+    <w:lvl w:ilvl="6" w:tentative="1">
+      <w:start w:val="1"/>
+      <w:numFmt w:val="decimal"/>
+      <w:lvlText w:val="%7."/>
+      <w:lvlJc w:val="left"/>
+      <w:pPr>
+        <w:tabs>
+          <w:tab w:val="num" w:pos="5040"/>
+        </w:tabs>
+        <w:ind w:left="5040" w:hanging="360"/>
+      </w:pPr>
+    </w:lvl>
+    <w:lvl w:ilvl="7" w:tentative="1">
+      <w:start w:val="1"/>
+      <w:numFmt w:val="decimal"/>
+      <w:lvlText w:val="%8."/>
+      <w:lvlJc w:val="left"/>
+      <w:pPr>
+        <w:tabs>
+          <w:tab w:val="num" w:pos="5760"/>
+        </w:tabs>
+        <w:ind w:left="5760" w:hanging="360"/>
+      </w:pPr>
+    </w:lvl>
+    <w:lvl w:ilvl="8" w:tentative="1">
+      <w:start w:val="1"/>
+      <w:numFmt w:val="decimal"/>
+      <w:lvlText w:val="%9."/>
+      <w:lvlJc w:val="left"/>
+      <w:pPr>
+        <w:tabs>
+          <w:tab w:val="num" w:pos="6480"/>
+        </w:tabs>
+        <w:ind w:left="6480" w:hanging="360"/>
+      </w:pPr>
+    </w:lvl>
+  </w:abstractNum>
+  <w:abstractNum w:abstractNumId="12" w15:restartNumberingAfterBreak="0">
+    <w:nsid w:val="2F1E49AE"/>
+    <w:multiLevelType w:val="multilevel"/>
+    <w:tmpl w:val="C8ECA1C4"/>
+    <w:lvl w:ilvl="0">
+      <w:start w:val="1"/>
+      <w:numFmt w:val="bullet"/>
+      <w:lvlText w:val=""/>
+      <w:lvlJc w:val="left"/>
+      <w:pPr>
+        <w:tabs>
+          <w:tab w:val="num" w:pos="720"/>
+        </w:tabs>
+        <w:ind w:left="720" w:hanging="360"/>
+      </w:pPr>
+      <w:rPr>
+        <w:rFonts w:ascii="Symbol" w:hAnsi="Symbol" w:hint="default"/>
+        <w:sz w:val="20"/>
+      </w:rPr>
+    </w:lvl>
+    <w:lvl w:ilvl="1" w:tentative="1">
+      <w:start w:val="1"/>
+      <w:numFmt w:val="bullet"/>
+      <w:lvlText w:val="o"/>
+      <w:lvlJc w:val="left"/>
+      <w:pPr>
+        <w:tabs>
+          <w:tab w:val="num" w:pos="1440"/>
+        </w:tabs>
+        <w:ind w:left="1440" w:hanging="360"/>
+      </w:pPr>
+      <w:rPr>
+        <w:rFonts w:ascii="Courier New" w:hAnsi="Courier New" w:hint="default"/>
+        <w:sz w:val="20"/>
+      </w:rPr>
+    </w:lvl>
+    <w:lvl w:ilvl="2" w:tentative="1">
+      <w:start w:val="1"/>
+      <w:numFmt w:val="bullet"/>
+      <w:lvlText w:val=""/>
+      <w:lvlJc w:val="left"/>
+      <w:pPr>
+        <w:tabs>
+          <w:tab w:val="num" w:pos="2160"/>
+        </w:tabs>
+        <w:ind w:left="2160" w:hanging="360"/>
+      </w:pPr>
+      <w:rPr>
+        <w:rFonts w:ascii="Wingdings" w:hAnsi="Wingdings" w:hint="default"/>
+        <w:sz w:val="20"/>
+      </w:rPr>
+    </w:lvl>
+    <w:lvl w:ilvl="3" w:tentative="1">
+      <w:start w:val="1"/>
+      <w:numFmt w:val="bullet"/>
+      <w:lvlText w:val=""/>
+      <w:lvlJc w:val="left"/>
+      <w:pPr>
+        <w:tabs>
+          <w:tab w:val="num" w:pos="2880"/>
+        </w:tabs>
+        <w:ind w:left="2880" w:hanging="360"/>
+      </w:pPr>
+      <w:rPr>
+        <w:rFonts w:ascii="Wingdings" w:hAnsi="Wingdings" w:hint="default"/>
+        <w:sz w:val="20"/>
+      </w:rPr>
+    </w:lvl>
+    <w:lvl w:ilvl="4" w:tentative="1">
+      <w:start w:val="1"/>
+      <w:numFmt w:val="bullet"/>
+      <w:lvlText w:val=""/>
+      <w:lvlJc w:val="left"/>
+      <w:pPr>
+        <w:tabs>
+          <w:tab w:val="num" w:pos="3600"/>
+        </w:tabs>
+        <w:ind w:left="3600" w:hanging="360"/>
+      </w:pPr>
+      <w:rPr>
+        <w:rFonts w:ascii="Wingdings" w:hAnsi="Wingdings" w:hint="default"/>
+        <w:sz w:val="20"/>
+      </w:rPr>
+    </w:lvl>
+    <w:lvl w:ilvl="5" w:tentative="1">
+      <w:start w:val="1"/>
+      <w:numFmt w:val="bullet"/>
+      <w:lvlText w:val=""/>
+      <w:lvlJc w:val="left"/>
+      <w:pPr>
+        <w:tabs>
+          <w:tab w:val="num" w:pos="4320"/>
+        </w:tabs>
+        <w:ind w:left="4320" w:hanging="360"/>
+      </w:pPr>
+      <w:rPr>
+        <w:rFonts w:ascii="Wingdings" w:hAnsi="Wingdings" w:hint="default"/>
+        <w:sz w:val="20"/>
+      </w:rPr>
+    </w:lvl>
+    <w:lvl w:ilvl="6" w:tentative="1">
+      <w:start w:val="1"/>
+      <w:numFmt w:val="bullet"/>
+      <w:lvlText w:val=""/>
+      <w:lvlJc w:val="left"/>
+      <w:pPr>
+        <w:tabs>
+          <w:tab w:val="num" w:pos="5040"/>
+        </w:tabs>
+        <w:ind w:left="5040" w:hanging="360"/>
+      </w:pPr>
+      <w:rPr>
+        <w:rFonts w:ascii="Wingdings" w:hAnsi="Wingdings" w:hint="default"/>
+        <w:sz w:val="20"/>
+      </w:rPr>
+    </w:lvl>
+    <w:lvl w:ilvl="7" w:tentative="1">
+      <w:start w:val="1"/>
+      <w:numFmt w:val="bullet"/>
+      <w:lvlText w:val=""/>
+      <w:lvlJc w:val="left"/>
+      <w:pPr>
+        <w:tabs>
+          <w:tab w:val="num" w:pos="5760"/>
+        </w:tabs>
+        <w:ind w:left="5760" w:hanging="360"/>
+      </w:pPr>
+      <w:rPr>
+        <w:rFonts w:ascii="Wingdings" w:hAnsi="Wingdings" w:hint="default"/>
+        <w:sz w:val="20"/>
+      </w:rPr>
+    </w:lvl>
+    <w:lvl w:ilvl="8" w:tentative="1">
+      <w:start w:val="1"/>
+      <w:numFmt w:val="bullet"/>
+      <w:lvlText w:val=""/>
+      <w:lvlJc w:val="left"/>
+      <w:pPr>
+        <w:tabs>
+          <w:tab w:val="num" w:pos="6480"/>
+        </w:tabs>
+        <w:ind w:left="6480" w:hanging="360"/>
+      </w:pPr>
+      <w:rPr>
+        <w:rFonts w:ascii="Wingdings" w:hAnsi="Wingdings" w:hint="default"/>
+        <w:sz w:val="20"/>
+      </w:rPr>
+    </w:lvl>
+  </w:abstractNum>
+  <w:abstractNum w:abstractNumId="13" w15:restartNumberingAfterBreak="0">
     <w:nsid w:val="2F6A22E0"/>
     <w:multiLevelType w:val="multilevel"/>
     <w:tmpl w:val="2A30ED7E"/>
@@ -7518,7 +10358,7 @@
       </w:rPr>
     </w:lvl>
   </w:abstractNum>
-  <w:abstractNum w:abstractNumId="10" w15:restartNumberingAfterBreak="0">
+  <w:abstractNum w:abstractNumId="14" w15:restartNumberingAfterBreak="0">
     <w:nsid w:val="32801B6B"/>
     <w:multiLevelType w:val="multilevel"/>
     <w:tmpl w:val="1F00CB18"/>
@@ -7615,7 +10455,7 @@
       </w:pPr>
     </w:lvl>
   </w:abstractNum>
-  <w:abstractNum w:abstractNumId="11" w15:restartNumberingAfterBreak="0">
+  <w:abstractNum w:abstractNumId="15" w15:restartNumberingAfterBreak="0">
     <w:nsid w:val="32941E29"/>
     <w:multiLevelType w:val="multilevel"/>
     <w:tmpl w:val="A4EEBEA6"/>
@@ -7764,7 +10604,7 @@
       </w:rPr>
     </w:lvl>
   </w:abstractNum>
-  <w:abstractNum w:abstractNumId="12" w15:restartNumberingAfterBreak="0">
+  <w:abstractNum w:abstractNumId="16" w15:restartNumberingAfterBreak="0">
     <w:nsid w:val="35996340"/>
     <w:multiLevelType w:val="hybridMultilevel"/>
     <w:tmpl w:val="7E1EB54A"/>
@@ -7877,7 +10717,7 @@
       </w:pPr>
     </w:lvl>
   </w:abstractNum>
-  <w:abstractNum w:abstractNumId="13" w15:restartNumberingAfterBreak="0">
+  <w:abstractNum w:abstractNumId="17" w15:restartNumberingAfterBreak="0">
     <w:nsid w:val="372831C7"/>
     <w:multiLevelType w:val="hybridMultilevel"/>
     <w:tmpl w:val="B4406882"/>
@@ -7990,7 +10830,7 @@
       </w:rPr>
     </w:lvl>
   </w:abstractNum>
-  <w:abstractNum w:abstractNumId="14" w15:restartNumberingAfterBreak="0">
+  <w:abstractNum w:abstractNumId="18" w15:restartNumberingAfterBreak="0">
     <w:nsid w:val="387E6B9E"/>
     <w:multiLevelType w:val="multilevel"/>
     <w:tmpl w:val="A29A7462"/>
@@ -8139,7 +10979,7 @@
       </w:rPr>
     </w:lvl>
   </w:abstractNum>
-  <w:abstractNum w:abstractNumId="15" w15:restartNumberingAfterBreak="0">
+  <w:abstractNum w:abstractNumId="19" w15:restartNumberingAfterBreak="0">
     <w:nsid w:val="42EC11D9"/>
     <w:multiLevelType w:val="multilevel"/>
     <w:tmpl w:val="E3468814"/>
@@ -8288,7 +11128,156 @@
       </w:rPr>
     </w:lvl>
   </w:abstractNum>
-  <w:abstractNum w:abstractNumId="16" w15:restartNumberingAfterBreak="0">
+  <w:abstractNum w:abstractNumId="20" w15:restartNumberingAfterBreak="0">
+    <w:nsid w:val="436C45CB"/>
+    <w:multiLevelType w:val="multilevel"/>
+    <w:tmpl w:val="A58C80F6"/>
+    <w:lvl w:ilvl="0">
+      <w:start w:val="1"/>
+      <w:numFmt w:val="bullet"/>
+      <w:lvlText w:val=""/>
+      <w:lvlJc w:val="left"/>
+      <w:pPr>
+        <w:tabs>
+          <w:tab w:val="num" w:pos="720"/>
+        </w:tabs>
+        <w:ind w:left="720" w:hanging="360"/>
+      </w:pPr>
+      <w:rPr>
+        <w:rFonts w:ascii="Symbol" w:hAnsi="Symbol" w:hint="default"/>
+        <w:sz w:val="20"/>
+      </w:rPr>
+    </w:lvl>
+    <w:lvl w:ilvl="1" w:tentative="1">
+      <w:start w:val="1"/>
+      <w:numFmt w:val="bullet"/>
+      <w:lvlText w:val="o"/>
+      <w:lvlJc w:val="left"/>
+      <w:pPr>
+        <w:tabs>
+          <w:tab w:val="num" w:pos="1440"/>
+        </w:tabs>
+        <w:ind w:left="1440" w:hanging="360"/>
+      </w:pPr>
+      <w:rPr>
+        <w:rFonts w:ascii="Courier New" w:hAnsi="Courier New" w:hint="default"/>
+        <w:sz w:val="20"/>
+      </w:rPr>
+    </w:lvl>
+    <w:lvl w:ilvl="2" w:tentative="1">
+      <w:start w:val="1"/>
+      <w:numFmt w:val="bullet"/>
+      <w:lvlText w:val=""/>
+      <w:lvlJc w:val="left"/>
+      <w:pPr>
+        <w:tabs>
+          <w:tab w:val="num" w:pos="2160"/>
+        </w:tabs>
+        <w:ind w:left="2160" w:hanging="360"/>
+      </w:pPr>
+      <w:rPr>
+        <w:rFonts w:ascii="Wingdings" w:hAnsi="Wingdings" w:hint="default"/>
+        <w:sz w:val="20"/>
+      </w:rPr>
+    </w:lvl>
+    <w:lvl w:ilvl="3" w:tentative="1">
+      <w:start w:val="1"/>
+      <w:numFmt w:val="bullet"/>
+      <w:lvlText w:val=""/>
+      <w:lvlJc w:val="left"/>
+      <w:pPr>
+        <w:tabs>
+          <w:tab w:val="num" w:pos="2880"/>
+        </w:tabs>
+        <w:ind w:left="2880" w:hanging="360"/>
+      </w:pPr>
+      <w:rPr>
+        <w:rFonts w:ascii="Wingdings" w:hAnsi="Wingdings" w:hint="default"/>
+        <w:sz w:val="20"/>
+      </w:rPr>
+    </w:lvl>
+    <w:lvl w:ilvl="4" w:tentative="1">
+      <w:start w:val="1"/>
+      <w:numFmt w:val="bullet"/>
+      <w:lvlText w:val=""/>
+      <w:lvlJc w:val="left"/>
+      <w:pPr>
+        <w:tabs>
+          <w:tab w:val="num" w:pos="3600"/>
+        </w:tabs>
+        <w:ind w:left="3600" w:hanging="360"/>
+      </w:pPr>
+      <w:rPr>
+        <w:rFonts w:ascii="Wingdings" w:hAnsi="Wingdings" w:hint="default"/>
+        <w:sz w:val="20"/>
+      </w:rPr>
+    </w:lvl>
+    <w:lvl w:ilvl="5" w:tentative="1">
+      <w:start w:val="1"/>
+      <w:numFmt w:val="bullet"/>
+      <w:lvlText w:val=""/>
+      <w:lvlJc w:val="left"/>
+      <w:pPr>
+        <w:tabs>
+          <w:tab w:val="num" w:pos="4320"/>
+        </w:tabs>
+        <w:ind w:left="4320" w:hanging="360"/>
+      </w:pPr>
+      <w:rPr>
+        <w:rFonts w:ascii="Wingdings" w:hAnsi="Wingdings" w:hint="default"/>
+        <w:sz w:val="20"/>
+      </w:rPr>
+    </w:lvl>
+    <w:lvl w:ilvl="6" w:tentative="1">
+      <w:start w:val="1"/>
+      <w:numFmt w:val="bullet"/>
+      <w:lvlText w:val=""/>
+      <w:lvlJc w:val="left"/>
+      <w:pPr>
+        <w:tabs>
+          <w:tab w:val="num" w:pos="5040"/>
+        </w:tabs>
+        <w:ind w:left="5040" w:hanging="360"/>
+      </w:pPr>
+      <w:rPr>
+        <w:rFonts w:ascii="Wingdings" w:hAnsi="Wingdings" w:hint="default"/>
+        <w:sz w:val="20"/>
+      </w:rPr>
+    </w:lvl>
+    <w:lvl w:ilvl="7" w:tentative="1">
+      <w:start w:val="1"/>
+      <w:numFmt w:val="bullet"/>
+      <w:lvlText w:val=""/>
+      <w:lvlJc w:val="left"/>
+      <w:pPr>
+        <w:tabs>
+          <w:tab w:val="num" w:pos="5760"/>
+        </w:tabs>
+        <w:ind w:left="5760" w:hanging="360"/>
+      </w:pPr>
+      <w:rPr>
+        <w:rFonts w:ascii="Wingdings" w:hAnsi="Wingdings" w:hint="default"/>
+        <w:sz w:val="20"/>
+      </w:rPr>
+    </w:lvl>
+    <w:lvl w:ilvl="8" w:tentative="1">
+      <w:start w:val="1"/>
+      <w:numFmt w:val="bullet"/>
+      <w:lvlText w:val=""/>
+      <w:lvlJc w:val="left"/>
+      <w:pPr>
+        <w:tabs>
+          <w:tab w:val="num" w:pos="6480"/>
+        </w:tabs>
+        <w:ind w:left="6480" w:hanging="360"/>
+      </w:pPr>
+      <w:rPr>
+        <w:rFonts w:ascii="Wingdings" w:hAnsi="Wingdings" w:hint="default"/>
+        <w:sz w:val="20"/>
+      </w:rPr>
+    </w:lvl>
+  </w:abstractNum>
+  <w:abstractNum w:abstractNumId="21" w15:restartNumberingAfterBreak="0">
     <w:nsid w:val="444D0DA1"/>
     <w:multiLevelType w:val="multilevel"/>
     <w:tmpl w:val="347AAA5C"/>
@@ -8437,7 +11426,7 @@
       </w:rPr>
     </w:lvl>
   </w:abstractNum>
-  <w:abstractNum w:abstractNumId="17" w15:restartNumberingAfterBreak="0">
+  <w:abstractNum w:abstractNumId="22" w15:restartNumberingAfterBreak="0">
     <w:nsid w:val="44510BD8"/>
     <w:multiLevelType w:val="hybridMultilevel"/>
     <w:tmpl w:val="C340EAB8"/>
@@ -8549,18 +11538,24 @@
       </w:rPr>
     </w:lvl>
   </w:abstractNum>
-  <w:abstractNum w:abstractNumId="18" w15:restartNumberingAfterBreak="0">
+  <w:abstractNum w:abstractNumId="23" w15:restartNumberingAfterBreak="0">
     <w:nsid w:val="44B93727"/>
     <w:multiLevelType w:val="multilevel"/>
-    <w:tmpl w:val="A40C10A4"/>
+    <w:tmpl w:val="48986CC4"/>
     <w:lvl w:ilvl="0">
       <w:start w:val="1"/>
       <w:numFmt w:val="decimal"/>
       <w:lvlText w:val="%1."/>
       <w:lvlJc w:val="left"/>
       <w:pPr>
-        <w:ind w:left="720" w:hanging="360"/>
-      </w:pPr>
+        <w:ind w:left="630" w:hanging="360"/>
+      </w:pPr>
+      <w:rPr>
+        <w:b/>
+        <w:bCs/>
+        <w:sz w:val="36"/>
+        <w:szCs w:val="36"/>
+      </w:rPr>
     </w:lvl>
     <w:lvl w:ilvl="1">
       <w:start w:val="1"/>
@@ -8643,7 +11638,7 @@
       </w:pPr>
     </w:lvl>
   </w:abstractNum>
-  <w:abstractNum w:abstractNumId="19" w15:restartNumberingAfterBreak="0">
+  <w:abstractNum w:abstractNumId="24" w15:restartNumberingAfterBreak="0">
     <w:nsid w:val="47E030DF"/>
     <w:multiLevelType w:val="multilevel"/>
     <w:tmpl w:val="42D8E8B2"/>
@@ -8792,7 +11787,7 @@
       </w:rPr>
     </w:lvl>
   </w:abstractNum>
-  <w:abstractNum w:abstractNumId="20" w15:restartNumberingAfterBreak="0">
+  <w:abstractNum w:abstractNumId="25" w15:restartNumberingAfterBreak="0">
     <w:nsid w:val="4EB712DF"/>
     <w:multiLevelType w:val="multilevel"/>
     <w:tmpl w:val="2F869196"/>
@@ -8941,7 +11936,7 @@
       </w:rPr>
     </w:lvl>
   </w:abstractNum>
-  <w:abstractNum w:abstractNumId="21" w15:restartNumberingAfterBreak="0">
+  <w:abstractNum w:abstractNumId="26" w15:restartNumberingAfterBreak="0">
     <w:nsid w:val="54701361"/>
     <w:multiLevelType w:val="multilevel"/>
     <w:tmpl w:val="68608D52"/>
@@ -9090,7 +12085,7 @@
       </w:rPr>
     </w:lvl>
   </w:abstractNum>
-  <w:abstractNum w:abstractNumId="22" w15:restartNumberingAfterBreak="0">
+  <w:abstractNum w:abstractNumId="27" w15:restartNumberingAfterBreak="0">
     <w:nsid w:val="58BE4CE3"/>
     <w:multiLevelType w:val="hybridMultilevel"/>
     <w:tmpl w:val="AB50A582"/>
@@ -9203,7 +12198,7 @@
       </w:rPr>
     </w:lvl>
   </w:abstractNum>
-  <w:abstractNum w:abstractNumId="23" w15:restartNumberingAfterBreak="0">
+  <w:abstractNum w:abstractNumId="28" w15:restartNumberingAfterBreak="0">
     <w:nsid w:val="606A11BB"/>
     <w:multiLevelType w:val="multilevel"/>
     <w:tmpl w:val="B62E72B6"/>
@@ -9316,7 +12311,7 @@
       </w:pPr>
     </w:lvl>
   </w:abstractNum>
-  <w:abstractNum w:abstractNumId="24" w15:restartNumberingAfterBreak="0">
+  <w:abstractNum w:abstractNumId="29" w15:restartNumberingAfterBreak="0">
     <w:nsid w:val="61AD6544"/>
     <w:multiLevelType w:val="multilevel"/>
     <w:tmpl w:val="7FD8F09E"/>
@@ -9465,7 +12460,7 @@
       </w:rPr>
     </w:lvl>
   </w:abstractNum>
-  <w:abstractNum w:abstractNumId="25" w15:restartNumberingAfterBreak="0">
+  <w:abstractNum w:abstractNumId="30" w15:restartNumberingAfterBreak="0">
     <w:nsid w:val="653B43B6"/>
     <w:multiLevelType w:val="multilevel"/>
     <w:tmpl w:val="999439FA"/>
@@ -9614,7 +12609,156 @@
       </w:rPr>
     </w:lvl>
   </w:abstractNum>
-  <w:abstractNum w:abstractNumId="26" w15:restartNumberingAfterBreak="0">
+  <w:abstractNum w:abstractNumId="31" w15:restartNumberingAfterBreak="0">
+    <w:nsid w:val="667143D3"/>
+    <w:multiLevelType w:val="multilevel"/>
+    <w:tmpl w:val="5114C6CA"/>
+    <w:lvl w:ilvl="0">
+      <w:start w:val="1"/>
+      <w:numFmt w:val="bullet"/>
+      <w:lvlText w:val=""/>
+      <w:lvlJc w:val="left"/>
+      <w:pPr>
+        <w:tabs>
+          <w:tab w:val="num" w:pos="720"/>
+        </w:tabs>
+        <w:ind w:left="720" w:hanging="360"/>
+      </w:pPr>
+      <w:rPr>
+        <w:rFonts w:ascii="Symbol" w:hAnsi="Symbol" w:hint="default"/>
+        <w:sz w:val="20"/>
+      </w:rPr>
+    </w:lvl>
+    <w:lvl w:ilvl="1" w:tentative="1">
+      <w:start w:val="1"/>
+      <w:numFmt w:val="bullet"/>
+      <w:lvlText w:val="o"/>
+      <w:lvlJc w:val="left"/>
+      <w:pPr>
+        <w:tabs>
+          <w:tab w:val="num" w:pos="1440"/>
+        </w:tabs>
+        <w:ind w:left="1440" w:hanging="360"/>
+      </w:pPr>
+      <w:rPr>
+        <w:rFonts w:ascii="Courier New" w:hAnsi="Courier New" w:hint="default"/>
+        <w:sz w:val="20"/>
+      </w:rPr>
+    </w:lvl>
+    <w:lvl w:ilvl="2" w:tentative="1">
+      <w:start w:val="1"/>
+      <w:numFmt w:val="bullet"/>
+      <w:lvlText w:val=""/>
+      <w:lvlJc w:val="left"/>
+      <w:pPr>
+        <w:tabs>
+          <w:tab w:val="num" w:pos="2160"/>
+        </w:tabs>
+        <w:ind w:left="2160" w:hanging="360"/>
+      </w:pPr>
+      <w:rPr>
+        <w:rFonts w:ascii="Wingdings" w:hAnsi="Wingdings" w:hint="default"/>
+        <w:sz w:val="20"/>
+      </w:rPr>
+    </w:lvl>
+    <w:lvl w:ilvl="3" w:tentative="1">
+      <w:start w:val="1"/>
+      <w:numFmt w:val="bullet"/>
+      <w:lvlText w:val=""/>
+      <w:lvlJc w:val="left"/>
+      <w:pPr>
+        <w:tabs>
+          <w:tab w:val="num" w:pos="2880"/>
+        </w:tabs>
+        <w:ind w:left="2880" w:hanging="360"/>
+      </w:pPr>
+      <w:rPr>
+        <w:rFonts w:ascii="Wingdings" w:hAnsi="Wingdings" w:hint="default"/>
+        <w:sz w:val="20"/>
+      </w:rPr>
+    </w:lvl>
+    <w:lvl w:ilvl="4" w:tentative="1">
+      <w:start w:val="1"/>
+      <w:numFmt w:val="bullet"/>
+      <w:lvlText w:val=""/>
+      <w:lvlJc w:val="left"/>
+      <w:pPr>
+        <w:tabs>
+          <w:tab w:val="num" w:pos="3600"/>
+        </w:tabs>
+        <w:ind w:left="3600" w:hanging="360"/>
+      </w:pPr>
+      <w:rPr>
+        <w:rFonts w:ascii="Wingdings" w:hAnsi="Wingdings" w:hint="default"/>
+        <w:sz w:val="20"/>
+      </w:rPr>
+    </w:lvl>
+    <w:lvl w:ilvl="5" w:tentative="1">
+      <w:start w:val="1"/>
+      <w:numFmt w:val="bullet"/>
+      <w:lvlText w:val=""/>
+      <w:lvlJc w:val="left"/>
+      <w:pPr>
+        <w:tabs>
+          <w:tab w:val="num" w:pos="4320"/>
+        </w:tabs>
+        <w:ind w:left="4320" w:hanging="360"/>
+      </w:pPr>
+      <w:rPr>
+        <w:rFonts w:ascii="Wingdings" w:hAnsi="Wingdings" w:hint="default"/>
+        <w:sz w:val="20"/>
+      </w:rPr>
+    </w:lvl>
+    <w:lvl w:ilvl="6" w:tentative="1">
+      <w:start w:val="1"/>
+      <w:numFmt w:val="bullet"/>
+      <w:lvlText w:val=""/>
+      <w:lvlJc w:val="left"/>
+      <w:pPr>
+        <w:tabs>
+          <w:tab w:val="num" w:pos="5040"/>
+        </w:tabs>
+        <w:ind w:left="5040" w:hanging="360"/>
+      </w:pPr>
+      <w:rPr>
+        <w:rFonts w:ascii="Wingdings" w:hAnsi="Wingdings" w:hint="default"/>
+        <w:sz w:val="20"/>
+      </w:rPr>
+    </w:lvl>
+    <w:lvl w:ilvl="7" w:tentative="1">
+      <w:start w:val="1"/>
+      <w:numFmt w:val="bullet"/>
+      <w:lvlText w:val=""/>
+      <w:lvlJc w:val="left"/>
+      <w:pPr>
+        <w:tabs>
+          <w:tab w:val="num" w:pos="5760"/>
+        </w:tabs>
+        <w:ind w:left="5760" w:hanging="360"/>
+      </w:pPr>
+      <w:rPr>
+        <w:rFonts w:ascii="Wingdings" w:hAnsi="Wingdings" w:hint="default"/>
+        <w:sz w:val="20"/>
+      </w:rPr>
+    </w:lvl>
+    <w:lvl w:ilvl="8" w:tentative="1">
+      <w:start w:val="1"/>
+      <w:numFmt w:val="bullet"/>
+      <w:lvlText w:val=""/>
+      <w:lvlJc w:val="left"/>
+      <w:pPr>
+        <w:tabs>
+          <w:tab w:val="num" w:pos="6480"/>
+        </w:tabs>
+        <w:ind w:left="6480" w:hanging="360"/>
+      </w:pPr>
+      <w:rPr>
+        <w:rFonts w:ascii="Wingdings" w:hAnsi="Wingdings" w:hint="default"/>
+        <w:sz w:val="20"/>
+      </w:rPr>
+    </w:lvl>
+  </w:abstractNum>
+  <w:abstractNum w:abstractNumId="32" w15:restartNumberingAfterBreak="0">
     <w:nsid w:val="670913AB"/>
     <w:multiLevelType w:val="multilevel"/>
     <w:tmpl w:val="5074D0AE"/>
@@ -9731,7 +12875,7 @@
       </w:pPr>
     </w:lvl>
   </w:abstractNum>
-  <w:abstractNum w:abstractNumId="27" w15:restartNumberingAfterBreak="0">
+  <w:abstractNum w:abstractNumId="33" w15:restartNumberingAfterBreak="0">
     <w:nsid w:val="69C904C3"/>
     <w:multiLevelType w:val="hybridMultilevel"/>
     <w:tmpl w:val="AF026E8C"/>
@@ -9844,7 +12988,7 @@
       </w:pPr>
     </w:lvl>
   </w:abstractNum>
-  <w:abstractNum w:abstractNumId="28" w15:restartNumberingAfterBreak="0">
+  <w:abstractNum w:abstractNumId="34" w15:restartNumberingAfterBreak="0">
     <w:nsid w:val="6B270924"/>
     <w:multiLevelType w:val="multilevel"/>
     <w:tmpl w:val="989E6BBC"/>
@@ -9993,7 +13137,7 @@
       </w:rPr>
     </w:lvl>
   </w:abstractNum>
-  <w:abstractNum w:abstractNumId="29" w15:restartNumberingAfterBreak="0">
+  <w:abstractNum w:abstractNumId="35" w15:restartNumberingAfterBreak="0">
     <w:nsid w:val="6D9A0DF0"/>
     <w:multiLevelType w:val="multilevel"/>
     <w:tmpl w:val="1F00CB18"/>
@@ -10090,7 +13234,7 @@
       </w:pPr>
     </w:lvl>
   </w:abstractNum>
-  <w:abstractNum w:abstractNumId="30" w15:restartNumberingAfterBreak="0">
+  <w:abstractNum w:abstractNumId="36" w15:restartNumberingAfterBreak="0">
     <w:nsid w:val="703B48CE"/>
     <w:multiLevelType w:val="hybridMultilevel"/>
     <w:tmpl w:val="53F44D76"/>
@@ -10202,7 +13346,7 @@
       </w:rPr>
     </w:lvl>
   </w:abstractNum>
-  <w:abstractNum w:abstractNumId="31" w15:restartNumberingAfterBreak="0">
+  <w:abstractNum w:abstractNumId="37" w15:restartNumberingAfterBreak="0">
     <w:nsid w:val="704E2B5C"/>
     <w:multiLevelType w:val="multilevel"/>
     <w:tmpl w:val="2A5A1AA6"/>
@@ -10351,7 +13495,7 @@
       </w:rPr>
     </w:lvl>
   </w:abstractNum>
-  <w:abstractNum w:abstractNumId="32" w15:restartNumberingAfterBreak="0">
+  <w:abstractNum w:abstractNumId="38" w15:restartNumberingAfterBreak="0">
     <w:nsid w:val="7236519B"/>
     <w:multiLevelType w:val="multilevel"/>
     <w:tmpl w:val="D0A25720"/>
@@ -10500,7 +13644,7 @@
       </w:rPr>
     </w:lvl>
   </w:abstractNum>
-  <w:abstractNum w:abstractNumId="33" w15:restartNumberingAfterBreak="0">
+  <w:abstractNum w:abstractNumId="39" w15:restartNumberingAfterBreak="0">
     <w:nsid w:val="74A82BED"/>
     <w:multiLevelType w:val="hybridMultilevel"/>
     <w:tmpl w:val="DA2676AA"/>
@@ -10613,7 +13757,7 @@
       </w:rPr>
     </w:lvl>
   </w:abstractNum>
-  <w:abstractNum w:abstractNumId="34" w15:restartNumberingAfterBreak="0">
+  <w:abstractNum w:abstractNumId="40" w15:restartNumberingAfterBreak="0">
     <w:nsid w:val="7C301A80"/>
     <w:multiLevelType w:val="multilevel"/>
     <w:tmpl w:val="A8B0ECE8"/>
@@ -10762,7 +13906,7 @@
       </w:rPr>
     </w:lvl>
   </w:abstractNum>
-  <w:abstractNum w:abstractNumId="35" w15:restartNumberingAfterBreak="0">
+  <w:abstractNum w:abstractNumId="41" w15:restartNumberingAfterBreak="0">
     <w:nsid w:val="7DBF5CE2"/>
     <w:multiLevelType w:val="multilevel"/>
     <w:tmpl w:val="143A61E0"/>
@@ -10911,7 +14055,7 @@
       </w:rPr>
     </w:lvl>
   </w:abstractNum>
-  <w:abstractNum w:abstractNumId="36" w15:restartNumberingAfterBreak="0">
+  <w:abstractNum w:abstractNumId="42" w15:restartNumberingAfterBreak="0">
     <w:nsid w:val="7DD7685F"/>
     <w:multiLevelType w:val="multilevel"/>
     <w:tmpl w:val="99C24998"/>
@@ -11060,11 +14204,160 @@
       </w:rPr>
     </w:lvl>
   </w:abstractNum>
+  <w:abstractNum w:abstractNumId="43" w15:restartNumberingAfterBreak="0">
+    <w:nsid w:val="7FCE58EE"/>
+    <w:multiLevelType w:val="multilevel"/>
+    <w:tmpl w:val="B7327142"/>
+    <w:lvl w:ilvl="0">
+      <w:start w:val="1"/>
+      <w:numFmt w:val="bullet"/>
+      <w:lvlText w:val=""/>
+      <w:lvlJc w:val="left"/>
+      <w:pPr>
+        <w:tabs>
+          <w:tab w:val="num" w:pos="720"/>
+        </w:tabs>
+        <w:ind w:left="720" w:hanging="360"/>
+      </w:pPr>
+      <w:rPr>
+        <w:rFonts w:ascii="Symbol" w:hAnsi="Symbol" w:hint="default"/>
+        <w:sz w:val="20"/>
+      </w:rPr>
+    </w:lvl>
+    <w:lvl w:ilvl="1" w:tentative="1">
+      <w:start w:val="1"/>
+      <w:numFmt w:val="bullet"/>
+      <w:lvlText w:val="o"/>
+      <w:lvlJc w:val="left"/>
+      <w:pPr>
+        <w:tabs>
+          <w:tab w:val="num" w:pos="1440"/>
+        </w:tabs>
+        <w:ind w:left="1440" w:hanging="360"/>
+      </w:pPr>
+      <w:rPr>
+        <w:rFonts w:ascii="Courier New" w:hAnsi="Courier New" w:hint="default"/>
+        <w:sz w:val="20"/>
+      </w:rPr>
+    </w:lvl>
+    <w:lvl w:ilvl="2" w:tentative="1">
+      <w:start w:val="1"/>
+      <w:numFmt w:val="bullet"/>
+      <w:lvlText w:val=""/>
+      <w:lvlJc w:val="left"/>
+      <w:pPr>
+        <w:tabs>
+          <w:tab w:val="num" w:pos="2160"/>
+        </w:tabs>
+        <w:ind w:left="2160" w:hanging="360"/>
+      </w:pPr>
+      <w:rPr>
+        <w:rFonts w:ascii="Wingdings" w:hAnsi="Wingdings" w:hint="default"/>
+        <w:sz w:val="20"/>
+      </w:rPr>
+    </w:lvl>
+    <w:lvl w:ilvl="3" w:tentative="1">
+      <w:start w:val="1"/>
+      <w:numFmt w:val="bullet"/>
+      <w:lvlText w:val=""/>
+      <w:lvlJc w:val="left"/>
+      <w:pPr>
+        <w:tabs>
+          <w:tab w:val="num" w:pos="2880"/>
+        </w:tabs>
+        <w:ind w:left="2880" w:hanging="360"/>
+      </w:pPr>
+      <w:rPr>
+        <w:rFonts w:ascii="Wingdings" w:hAnsi="Wingdings" w:hint="default"/>
+        <w:sz w:val="20"/>
+      </w:rPr>
+    </w:lvl>
+    <w:lvl w:ilvl="4" w:tentative="1">
+      <w:start w:val="1"/>
+      <w:numFmt w:val="bullet"/>
+      <w:lvlText w:val=""/>
+      <w:lvlJc w:val="left"/>
+      <w:pPr>
+        <w:tabs>
+          <w:tab w:val="num" w:pos="3600"/>
+        </w:tabs>
+        <w:ind w:left="3600" w:hanging="360"/>
+      </w:pPr>
+      <w:rPr>
+        <w:rFonts w:ascii="Wingdings" w:hAnsi="Wingdings" w:hint="default"/>
+        <w:sz w:val="20"/>
+      </w:rPr>
+    </w:lvl>
+    <w:lvl w:ilvl="5" w:tentative="1">
+      <w:start w:val="1"/>
+      <w:numFmt w:val="bullet"/>
+      <w:lvlText w:val=""/>
+      <w:lvlJc w:val="left"/>
+      <w:pPr>
+        <w:tabs>
+          <w:tab w:val="num" w:pos="4320"/>
+        </w:tabs>
+        <w:ind w:left="4320" w:hanging="360"/>
+      </w:pPr>
+      <w:rPr>
+        <w:rFonts w:ascii="Wingdings" w:hAnsi="Wingdings" w:hint="default"/>
+        <w:sz w:val="20"/>
+      </w:rPr>
+    </w:lvl>
+    <w:lvl w:ilvl="6" w:tentative="1">
+      <w:start w:val="1"/>
+      <w:numFmt w:val="bullet"/>
+      <w:lvlText w:val=""/>
+      <w:lvlJc w:val="left"/>
+      <w:pPr>
+        <w:tabs>
+          <w:tab w:val="num" w:pos="5040"/>
+        </w:tabs>
+        <w:ind w:left="5040" w:hanging="360"/>
+      </w:pPr>
+      <w:rPr>
+        <w:rFonts w:ascii="Wingdings" w:hAnsi="Wingdings" w:hint="default"/>
+        <w:sz w:val="20"/>
+      </w:rPr>
+    </w:lvl>
+    <w:lvl w:ilvl="7" w:tentative="1">
+      <w:start w:val="1"/>
+      <w:numFmt w:val="bullet"/>
+      <w:lvlText w:val=""/>
+      <w:lvlJc w:val="left"/>
+      <w:pPr>
+        <w:tabs>
+          <w:tab w:val="num" w:pos="5760"/>
+        </w:tabs>
+        <w:ind w:left="5760" w:hanging="360"/>
+      </w:pPr>
+      <w:rPr>
+        <w:rFonts w:ascii="Wingdings" w:hAnsi="Wingdings" w:hint="default"/>
+        <w:sz w:val="20"/>
+      </w:rPr>
+    </w:lvl>
+    <w:lvl w:ilvl="8" w:tentative="1">
+      <w:start w:val="1"/>
+      <w:numFmt w:val="bullet"/>
+      <w:lvlText w:val=""/>
+      <w:lvlJc w:val="left"/>
+      <w:pPr>
+        <w:tabs>
+          <w:tab w:val="num" w:pos="6480"/>
+        </w:tabs>
+        <w:ind w:left="6480" w:hanging="360"/>
+      </w:pPr>
+      <w:rPr>
+        <w:rFonts w:ascii="Wingdings" w:hAnsi="Wingdings" w:hint="default"/>
+        <w:sz w:val="20"/>
+      </w:rPr>
+    </w:lvl>
+  </w:abstractNum>
   <w:num w:numId="1" w16cid:durableId="837110844">
-    <w:abstractNumId w:val="18"/>
+    <w:abstractNumId w:val="23"/>
   </w:num>
   <w:num w:numId="2" w16cid:durableId="358431944">
-    <w:abstractNumId w:val="27"/>
+    <w:abstractNumId w:val="33"/>
     <w:lvlOverride w:ilvl="0"/>
     <w:lvlOverride w:ilvl="1">
       <w:startOverride w:val="1"/>
@@ -11092,7 +14385,7 @@
     </w:lvlOverride>
   </w:num>
   <w:num w:numId="3" w16cid:durableId="1853492327">
-    <w:abstractNumId w:val="12"/>
+    <w:abstractNumId w:val="16"/>
     <w:lvlOverride w:ilvl="0"/>
     <w:lvlOverride w:ilvl="1">
       <w:startOverride w:val="1"/>
@@ -11120,109 +14413,130 @@
     </w:lvlOverride>
   </w:num>
   <w:num w:numId="4" w16cid:durableId="71587209">
-    <w:abstractNumId w:val="12"/>
+    <w:abstractNumId w:val="16"/>
   </w:num>
   <w:num w:numId="5" w16cid:durableId="2125035059">
+    <w:abstractNumId w:val="14"/>
+  </w:num>
+  <w:num w:numId="6" w16cid:durableId="1778016651">
+    <w:abstractNumId w:val="35"/>
+  </w:num>
+  <w:num w:numId="7" w16cid:durableId="596405367">
+    <w:abstractNumId w:val="5"/>
+  </w:num>
+  <w:num w:numId="8" w16cid:durableId="1549994976">
+    <w:abstractNumId w:val="22"/>
+  </w:num>
+  <w:num w:numId="9" w16cid:durableId="502667795">
+    <w:abstractNumId w:val="32"/>
+  </w:num>
+  <w:num w:numId="10" w16cid:durableId="529605192">
+    <w:abstractNumId w:val="41"/>
+  </w:num>
+  <w:num w:numId="11" w16cid:durableId="1428503976">
+    <w:abstractNumId w:val="24"/>
+  </w:num>
+  <w:num w:numId="12" w16cid:durableId="1598366283">
+    <w:abstractNumId w:val="7"/>
+  </w:num>
+  <w:num w:numId="13" w16cid:durableId="2106461344">
+    <w:abstractNumId w:val="3"/>
+  </w:num>
+  <w:num w:numId="14" w16cid:durableId="1556043943">
     <w:abstractNumId w:val="10"/>
   </w:num>
-  <w:num w:numId="6" w16cid:durableId="1778016651">
-    <w:abstractNumId w:val="29"/>
+  <w:num w:numId="15" w16cid:durableId="478696471">
+    <w:abstractNumId w:val="18"/>
   </w:num>
-  <w:num w:numId="7" w16cid:durableId="596405367">
+  <w:num w:numId="16" w16cid:durableId="1140851206">
+    <w:abstractNumId w:val="15"/>
+  </w:num>
+  <w:num w:numId="17" w16cid:durableId="472912195">
+    <w:abstractNumId w:val="27"/>
+  </w:num>
+  <w:num w:numId="18" w16cid:durableId="1510636333">
     <w:abstractNumId w:val="4"/>
   </w:num>
-  <w:num w:numId="8" w16cid:durableId="1549994976">
-    <w:abstractNumId w:val="17"/>
+  <w:num w:numId="19" w16cid:durableId="144397460">
+    <w:abstractNumId w:val="21"/>
   </w:num>
-  <w:num w:numId="9" w16cid:durableId="502667795">
-    <w:abstractNumId w:val="26"/>
+  <w:num w:numId="20" w16cid:durableId="1307006884">
+    <w:abstractNumId w:val="34"/>
   </w:num>
-  <w:num w:numId="10" w16cid:durableId="529605192">
-    <w:abstractNumId w:val="35"/>
-  </w:num>
-  <w:num w:numId="11" w16cid:durableId="1428503976">
+  <w:num w:numId="21" w16cid:durableId="2039817968">
     <w:abstractNumId w:val="19"/>
   </w:num>
-  <w:num w:numId="12" w16cid:durableId="1598366283">
-    <w:abstractNumId w:val="6"/>
-  </w:num>
-  <w:num w:numId="13" w16cid:durableId="2106461344">
-    <w:abstractNumId w:val="2"/>
-  </w:num>
-  <w:num w:numId="14" w16cid:durableId="1556043943">
-    <w:abstractNumId w:val="8"/>
-  </w:num>
-  <w:num w:numId="15" w16cid:durableId="478696471">
-    <w:abstractNumId w:val="14"/>
-  </w:num>
-  <w:num w:numId="16" w16cid:durableId="1140851206">
-    <w:abstractNumId w:val="11"/>
-  </w:num>
-  <w:num w:numId="17" w16cid:durableId="472912195">
-    <w:abstractNumId w:val="22"/>
-  </w:num>
-  <w:num w:numId="18" w16cid:durableId="1510636333">
-    <w:abstractNumId w:val="3"/>
-  </w:num>
-  <w:num w:numId="19" w16cid:durableId="144397460">
-    <w:abstractNumId w:val="16"/>
-  </w:num>
-  <w:num w:numId="20" w16cid:durableId="1307006884">
-    <w:abstractNumId w:val="28"/>
-  </w:num>
-  <w:num w:numId="21" w16cid:durableId="2039817968">
-    <w:abstractNumId w:val="15"/>
-  </w:num>
   <w:num w:numId="22" w16cid:durableId="2138913275">
-    <w:abstractNumId w:val="34"/>
+    <w:abstractNumId w:val="40"/>
   </w:num>
   <w:num w:numId="23" w16cid:durableId="1496265279">
     <w:abstractNumId w:val="0"/>
   </w:num>
   <w:num w:numId="24" w16cid:durableId="1058820860">
+    <w:abstractNumId w:val="30"/>
+  </w:num>
+  <w:num w:numId="25" w16cid:durableId="1757245797">
     <w:abstractNumId w:val="25"/>
   </w:num>
-  <w:num w:numId="25" w16cid:durableId="1757245797">
-    <w:abstractNumId w:val="20"/>
-  </w:num>
   <w:num w:numId="26" w16cid:durableId="1196231118">
-    <w:abstractNumId w:val="9"/>
+    <w:abstractNumId w:val="13"/>
   </w:num>
   <w:num w:numId="27" w16cid:durableId="2117863291">
-    <w:abstractNumId w:val="13"/>
+    <w:abstractNumId w:val="17"/>
   </w:num>
   <w:num w:numId="28" w16cid:durableId="754016558">
-    <w:abstractNumId w:val="33"/>
+    <w:abstractNumId w:val="39"/>
   </w:num>
   <w:num w:numId="29" w16cid:durableId="1173030782">
-    <w:abstractNumId w:val="30"/>
+    <w:abstractNumId w:val="36"/>
   </w:num>
   <w:num w:numId="30" w16cid:durableId="328216655">
-    <w:abstractNumId w:val="23"/>
+    <w:abstractNumId w:val="28"/>
   </w:num>
   <w:num w:numId="31" w16cid:durableId="493646309">
     <w:abstractNumId w:val="1"/>
   </w:num>
   <w:num w:numId="32" w16cid:durableId="236480644">
-    <w:abstractNumId w:val="7"/>
+    <w:abstractNumId w:val="9"/>
   </w:num>
   <w:num w:numId="33" w16cid:durableId="945501370">
-    <w:abstractNumId w:val="24"/>
+    <w:abstractNumId w:val="29"/>
   </w:num>
   <w:num w:numId="34" w16cid:durableId="1763724359">
-    <w:abstractNumId w:val="32"/>
+    <w:abstractNumId w:val="38"/>
   </w:num>
   <w:num w:numId="35" w16cid:durableId="1357853241">
-    <w:abstractNumId w:val="36"/>
+    <w:abstractNumId w:val="42"/>
   </w:num>
   <w:num w:numId="36" w16cid:durableId="1820268510">
+    <w:abstractNumId w:val="37"/>
+  </w:num>
+  <w:num w:numId="37" w16cid:durableId="172107732">
+    <w:abstractNumId w:val="26"/>
+  </w:num>
+  <w:num w:numId="38" w16cid:durableId="231238048">
+    <w:abstractNumId w:val="6"/>
+  </w:num>
+  <w:num w:numId="39" w16cid:durableId="1815248590">
+    <w:abstractNumId w:val="20"/>
+  </w:num>
+  <w:num w:numId="40" w16cid:durableId="1623225856">
+    <w:abstractNumId w:val="2"/>
+  </w:num>
+  <w:num w:numId="41" w16cid:durableId="1569807895">
+    <w:abstractNumId w:val="8"/>
+  </w:num>
+  <w:num w:numId="42" w16cid:durableId="899289999">
+    <w:abstractNumId w:val="12"/>
+  </w:num>
+  <w:num w:numId="43" w16cid:durableId="657538884">
+    <w:abstractNumId w:val="43"/>
+  </w:num>
+  <w:num w:numId="44" w16cid:durableId="1782605995">
     <w:abstractNumId w:val="31"/>
   </w:num>
-  <w:num w:numId="37" w16cid:durableId="172107732">
-    <w:abstractNumId w:val="21"/>
-  </w:num>
-  <w:num w:numId="38" w16cid:durableId="231238048">
-    <w:abstractNumId w:val="5"/>
+  <w:num w:numId="45" w16cid:durableId="201719830">
+    <w:abstractNumId w:val="11"/>
   </w:num>
 </w:numbering>
 </file>
@@ -12023,6 +15337,36 @@
       <w:color w:val="365F91" w:themeColor="accent1" w:themeShade="BF"/>
     </w:rPr>
   </w:style>
+  <w:style w:type="paragraph" w:styleId="HTMLPreformatted">
+    <w:name w:val="HTML Preformatted"/>
+    <w:basedOn w:val="Normal"/>
+    <w:link w:val="HTMLPreformattedChar"/>
+    <w:uiPriority w:val="99"/>
+    <w:semiHidden/>
+    <w:unhideWhenUsed/>
+    <w:rsid w:val="009526F8"/>
+    <w:pPr>
+      <w:spacing w:after="0" w:line="240" w:lineRule="auto"/>
+    </w:pPr>
+    <w:rPr>
+      <w:rFonts w:ascii="Consolas" w:hAnsi="Consolas"/>
+      <w:sz w:val="20"/>
+      <w:szCs w:val="20"/>
+    </w:rPr>
+  </w:style>
+  <w:style w:type="character" w:customStyle="1" w:styleId="HTMLPreformattedChar">
+    <w:name w:val="HTML Preformatted Char"/>
+    <w:basedOn w:val="DefaultParagraphFont"/>
+    <w:link w:val="HTMLPreformatted"/>
+    <w:uiPriority w:val="99"/>
+    <w:semiHidden/>
+    <w:rsid w:val="009526F8"/>
+    <w:rPr>
+      <w:rFonts w:ascii="Consolas" w:hAnsi="Consolas"/>
+      <w:sz w:val="20"/>
+      <w:szCs w:val="20"/>
+    </w:rPr>
+  </w:style>
 </w:styles>
 </file>
 

</xml_diff>